<commit_message>
Plan: RevenueCat's cost per case from its own pricing page
Co-Authored-By: Claude Fable 5.1 <noreply@anthropic.com>
Claude-Session: https://claude.ai/code/session_01FdLL4Wp3bi12KNX6zHRo7N
</commit_message>
<xml_diff>
--- a/EZvoxa Business Plan and Projections.docx
+++ b/EZvoxa Business Plan and Projections.docx
@@ -28,7 +28,7 @@
           <w:sz w:val="22"/>
           <w:szCs w:val="22"/>
         </w:rPr>
-        <w:t xml:space="preserve">Everything on record as of 7 September 2026, in one place.</w:t>
+        <w:t xml:space="preserve">Everything on record as of 7 September 2026, in one place. Revised the same day with RevenueCat’s cost.</w:t>
       </w:r>
     </w:p>
     <w:p>
@@ -7746,7 +7746,7 @@
           <w:sz w:val="22"/>
           <w:szCs w:val="22"/>
         </w:rPr>
-        <w:t xml:space="preserve">No middleman for billing (5 September). The model’s "net of fees" uses the store commission only; that is now the whole fee. No RevenueCat cost line is needed.</w:t>
+        <w:t xml:space="preserve">Billing through RevenueCat (decided 5 September against, reversed by Frank on 7 September: "I looked into it more and I am good using RevenueCat"). RevenueCat’s own pricing page, read 7 September: nothing up to $2,500 in monthly tracked revenue, then 1% of what is tracked. The model crosses $2,500 a month in Year 1 in every case, so the cost is 1% of everything the stores sell; school licenses are invoiced by us and are not tracked. At the working prices: Floor $2,271 a year by Year 5 and $7,528 over five years (1.6% of five-year net profit); Mid $5,966 a year and $19,773 over five years (1.3%); Ceiling $14,613 a year and $48,431 over five years (1.0%). Read as 1% of all tracked revenue once over the line; the other reading lowers it by $25 a month.</w:t>
       </w:r>
     </w:p>
     <w:p>
@@ -7957,6 +7957,24 @@
           <w:szCs w:val="22"/>
         </w:rPr>
         <w:t xml:space="preserve">Vercel and the key-value store: hosting and the family store. Current cost not recorded; take it from the Vercel billing page.</w:t>
+      </w:r>
+    </w:p>
+    <w:p>
+      <w:pPr>
+        <w:pStyle w:val="ListParagraph"/>
+        <w:numPr>
+          <w:ilvl w:val="0"/>
+          <w:numId w:val="2"/>
+        </w:numPr>
+        <w:spacing w:after="80"/>
+      </w:pPr>
+      <w:r>
+        <w:rPr>
+          <w:rFonts w:ascii="Calibri" w:cs="Calibri" w:eastAsia="Calibri" w:hAnsi="Calibri"/>
+          <w:sz w:val="22"/>
+          <w:szCs w:val="22"/>
+        </w:rPr>
+        <w:t xml:space="preserve">RevenueCat: 1% of store revenue once tracked revenue passes $2,500 a month (its own pricing page, 7 September). Section 6 has the figures per case.</w:t>
       </w:r>
     </w:p>
     <w:p>

</xml_diff>

<commit_message>
Master Hub widget on our domain: the pasted Executive Master Hub page rebuilt behind the family password, its national ramp computed by the finance model (clinics added, seats named per year), each roadmap claim with its standing, the webhook tab showing what the server really does; plan document gains the National case and the roadmap
Co-Authored-By: Claude Fable 5.1 <noreply@anthropic.com>
Claude-Session: https://claude.ai/code/session_01FdLL4Wp3bi12KNX6zHRo7N
</commit_message>
<xml_diff>
--- a/EZvoxa Business Plan and Projections.docx
+++ b/EZvoxa Business Plan and Projections.docx
@@ -28,7 +28,7 @@
           <w:sz w:val="22"/>
           <w:szCs w:val="22"/>
         </w:rPr>
-        <w:t xml:space="preserve">Revised 7 September 2026 from Frank’s document of the same day. Generated from the same formulas as the finance widget at app.ezvoxa.com/finance.html, so the two cannot disagree.</w:t>
+        <w:t xml:space="preserve">Revised 8 September 2026: the 7 September document’s three cases, plus the National case and the rollout roadmap from the Master Hub page pasted on 8 September. Generated from the same formulas as the finance widget (finance.html) and the Master Hub (hub.html) on our domain, so the three cannot disagree.</w:t>
       </w:r>
     </w:p>
     <w:p>
@@ -2006,7 +2006,7 @@
                 <w:sz w:val="14"/>
                 <w:szCs w:val="14"/>
               </w:rPr>
-              <w:t xml:space="preserve">Districts, seats</w:t>
+              <w:t xml:space="preserve">Districts, seats (clinics)</w:t>
             </w:r>
           </w:p>
         </w:tc>
@@ -4744,7 +4744,7 @@
                 <w:sz w:val="14"/>
                 <w:szCs w:val="14"/>
               </w:rPr>
-              <w:t xml:space="preserve">Districts, seats</w:t>
+              <w:t xml:space="preserve">Districts, seats (clinics)</w:t>
             </w:r>
           </w:p>
         </w:tc>
@@ -7482,7 +7482,7 @@
                 <w:sz w:val="14"/>
                 <w:szCs w:val="14"/>
               </w:rPr>
-              <w:t xml:space="preserve">Districts, seats</w:t>
+              <w:t xml:space="preserve">Districts, seats (clinics)</w:t>
             </w:r>
           </w:p>
         </w:tc>
@@ -10027,6 +10027,2757 @@
                 <w:szCs w:val="14"/>
               </w:rPr>
               <w:t xml:space="preserve">$4,889,687</w:t>
+            </w:r>
+          </w:p>
+        </w:tc>
+      </w:tr>
+    </w:tbl>
+    <w:p>
+      <w:pPr>
+        <w:spacing w:after="120"/>
+      </w:pPr>
+      <w:r>
+        <w:rPr>
+          <w:rFonts w:ascii="Calibri" w:cs="Calibri" w:eastAsia="Calibri" w:hAnsi="Calibri"/>
+          <w:sz w:val="22"/>
+          <w:szCs w:val="22"/>
+        </w:rPr>
+        <w:t xml:space="preserve"/>
+      </w:r>
+    </w:p>
+    <w:p>
+      <w:pPr>
+        <w:pStyle w:val="Heading2"/>
+        <w:spacing w:after="100" w:before="240"/>
+      </w:pPr>
+      <w:r>
+        <w:rPr>
+          <w:rFonts w:ascii="Calibri" w:cs="Calibri" w:eastAsia="Calibri" w:hAnsi="Calibri"/>
+        </w:rPr>
+        <w:t xml:space="preserve">National case: five-year net $6,911,806, 42,400 buyers, 6,500 subscribers, 17,500 district seats and 2,500 clinic seats at the end of Year 5</w:t>
+      </w:r>
+    </w:p>
+    <w:p>
+      <w:pPr>
+        <w:spacing w:after="120"/>
+      </w:pPr>
+      <w:r>
+        <w:rPr>
+          <w:rFonts w:ascii="Calibri" w:cs="Calibri" w:eastAsia="Calibri" w:hAnsi="Calibri"/>
+          <w:sz w:val="20"/>
+          <w:szCs w:val="20"/>
+        </w:rPr>
+        <w:t xml:space="preserve">The ramp is the Master Hub page’s, pasted 8 September and written by another AI: it names each year’s district seats outright and adds clinics as a channel. Nobody has said who the clinics are or what they pay, so clinic seats are priced like school seats. Its operating column bundled RevenueCat; here operating is that column minus 1% of the page’s own gross, which leaves $34,500, $53,700, $81,700, $114,700 and $147,700. The page showed $8,058,740 cumulative because it took out only the store’s 15% and that column and counted subscribers at year end.</w:t>
+      </w:r>
+    </w:p>
+    <w:tbl>
+      <w:tblPr>
+        <w:tblW w:type="dxa" w:w="11660"/>
+        <w:tblBorders>
+          <w:top w:val="single" w:color="auto" w:sz="4"/>
+          <w:left w:val="single" w:color="auto" w:sz="4"/>
+          <w:bottom w:val="single" w:color="auto" w:sz="4"/>
+          <w:right w:val="single" w:color="auto" w:sz="4"/>
+          <w:insideH w:val="single" w:color="auto" w:sz="4"/>
+          <w:insideV w:val="single" w:color="auto" w:sz="4"/>
+        </w:tblBorders>
+      </w:tblPr>
+      <w:tblGrid>
+        <w:gridCol w:w="520"/>
+        <w:gridCol w:w="560"/>
+        <w:gridCol w:w="560"/>
+        <w:gridCol w:w="560"/>
+        <w:gridCol w:w="900"/>
+        <w:gridCol w:w="720"/>
+        <w:gridCol w:w="760"/>
+        <w:gridCol w:w="720"/>
+        <w:gridCol w:w="760"/>
+        <w:gridCol w:w="700"/>
+        <w:gridCol w:w="660"/>
+        <w:gridCol w:w="620"/>
+        <w:gridCol w:w="700"/>
+        <w:gridCol w:w="700"/>
+        <w:gridCol w:w="700"/>
+        <w:gridCol w:w="720"/>
+        <w:gridCol w:w="800"/>
+      </w:tblGrid>
+      <w:tr>
+        <w:tc>
+          <w:tcPr>
+            <w:tcW w:type="dxa" w:w="520"/>
+            <w:shd w:fill="E8E3DA" w:color="auto" w:val="clear"/>
+            <w:tcMar>
+              <w:top w:type="dxa" w:w="50"/>
+              <w:left w:type="dxa" w:w="70"/>
+              <w:bottom w:type="dxa" w:w="50"/>
+              <w:right w:type="dxa" w:w="70"/>
+            </w:tcMar>
+          </w:tcPr>
+          <w:p>
+            <w:pPr>
+              <w:jc w:val="left"/>
+            </w:pPr>
+            <w:r>
+              <w:rPr>
+                <w:rFonts w:ascii="Calibri" w:cs="Calibri" w:eastAsia="Calibri" w:hAnsi="Calibri"/>
+                <w:b/>
+                <w:bCs/>
+                <w:sz w:val="14"/>
+                <w:szCs w:val="14"/>
+              </w:rPr>
+              <w:t xml:space="preserve">Year</w:t>
+            </w:r>
+          </w:p>
+        </w:tc>
+        <w:tc>
+          <w:tcPr>
+            <w:tcW w:type="dxa" w:w="560"/>
+            <w:shd w:fill="E8E3DA" w:color="auto" w:val="clear"/>
+            <w:tcMar>
+              <w:top w:type="dxa" w:w="50"/>
+              <w:left w:type="dxa" w:w="70"/>
+              <w:bottom w:type="dxa" w:w="50"/>
+              <w:right w:type="dxa" w:w="70"/>
+            </w:tcMar>
+          </w:tcPr>
+          <w:p>
+            <w:pPr>
+              <w:jc w:val="left"/>
+            </w:pPr>
+            <w:r>
+              <w:rPr>
+                <w:rFonts w:ascii="Calibri" w:cs="Calibri" w:eastAsia="Calibri" w:hAnsi="Calibri"/>
+                <w:b/>
+                <w:bCs/>
+                <w:sz w:val="14"/>
+                <w:szCs w:val="14"/>
+              </w:rPr>
+              <w:t xml:space="preserve">Buyers</w:t>
+            </w:r>
+          </w:p>
+        </w:tc>
+        <w:tc>
+          <w:tcPr>
+            <w:tcW w:type="dxa" w:w="560"/>
+            <w:shd w:fill="E8E3DA" w:color="auto" w:val="clear"/>
+            <w:tcMar>
+              <w:top w:type="dxa" w:w="50"/>
+              <w:left w:type="dxa" w:w="70"/>
+              <w:bottom w:type="dxa" w:w="50"/>
+              <w:right w:type="dxa" w:w="70"/>
+            </w:tcMar>
+          </w:tcPr>
+          <w:p>
+            <w:pPr>
+              <w:jc w:val="left"/>
+            </w:pPr>
+            <w:r>
+              <w:rPr>
+                <w:rFonts w:ascii="Calibri" w:cs="Calibri" w:eastAsia="Calibri" w:hAnsi="Calibri"/>
+                <w:b/>
+                <w:bCs/>
+                <w:sz w:val="14"/>
+                <w:szCs w:val="14"/>
+              </w:rPr>
+              <w:t xml:space="preserve">Subs, end</w:t>
+            </w:r>
+          </w:p>
+        </w:tc>
+        <w:tc>
+          <w:tcPr>
+            <w:tcW w:type="dxa" w:w="560"/>
+            <w:shd w:fill="E8E3DA" w:color="auto" w:val="clear"/>
+            <w:tcMar>
+              <w:top w:type="dxa" w:w="50"/>
+              <w:left w:type="dxa" w:w="70"/>
+              <w:bottom w:type="dxa" w:w="50"/>
+              <w:right w:type="dxa" w:w="70"/>
+            </w:tcMar>
+          </w:tcPr>
+          <w:p>
+            <w:pPr>
+              <w:jc w:val="left"/>
+            </w:pPr>
+            <w:r>
+              <w:rPr>
+                <w:rFonts w:ascii="Calibri" w:cs="Calibri" w:eastAsia="Calibri" w:hAnsi="Calibri"/>
+                <w:b/>
+                <w:bCs/>
+                <w:sz w:val="14"/>
+                <w:szCs w:val="14"/>
+              </w:rPr>
+              <w:t xml:space="preserve">Subs, avg</w:t>
+            </w:r>
+          </w:p>
+        </w:tc>
+        <w:tc>
+          <w:tcPr>
+            <w:tcW w:type="dxa" w:w="900"/>
+            <w:shd w:fill="E8E3DA" w:color="auto" w:val="clear"/>
+            <w:tcMar>
+              <w:top w:type="dxa" w:w="50"/>
+              <w:left w:type="dxa" w:w="70"/>
+              <w:bottom w:type="dxa" w:w="50"/>
+              <w:right w:type="dxa" w:w="70"/>
+            </w:tcMar>
+          </w:tcPr>
+          <w:p>
+            <w:pPr>
+              <w:jc w:val="left"/>
+            </w:pPr>
+            <w:r>
+              <w:rPr>
+                <w:rFonts w:ascii="Calibri" w:cs="Calibri" w:eastAsia="Calibri" w:hAnsi="Calibri"/>
+                <w:b/>
+                <w:bCs/>
+                <w:sz w:val="14"/>
+                <w:szCs w:val="14"/>
+              </w:rPr>
+              <w:t xml:space="preserve">Districts, seats (clinics)</w:t>
+            </w:r>
+          </w:p>
+        </w:tc>
+        <w:tc>
+          <w:tcPr>
+            <w:tcW w:type="dxa" w:w="720"/>
+            <w:shd w:fill="E8E3DA" w:color="auto" w:val="clear"/>
+            <w:tcMar>
+              <w:top w:type="dxa" w:w="50"/>
+              <w:left w:type="dxa" w:w="70"/>
+              <w:bottom w:type="dxa" w:w="50"/>
+              <w:right w:type="dxa" w:w="70"/>
+            </w:tcMar>
+          </w:tcPr>
+          <w:p>
+            <w:pPr>
+              <w:jc w:val="left"/>
+            </w:pPr>
+            <w:r>
+              <w:rPr>
+                <w:rFonts w:ascii="Calibri" w:cs="Calibri" w:eastAsia="Calibri" w:hAnsi="Calibri"/>
+                <w:b/>
+                <w:bCs/>
+                <w:sz w:val="14"/>
+                <w:szCs w:val="14"/>
+              </w:rPr>
+              <w:t xml:space="preserve">Talker</w:t>
+            </w:r>
+          </w:p>
+        </w:tc>
+        <w:tc>
+          <w:tcPr>
+            <w:tcW w:type="dxa" w:w="760"/>
+            <w:shd w:fill="E8E3DA" w:color="auto" w:val="clear"/>
+            <w:tcMar>
+              <w:top w:type="dxa" w:w="50"/>
+              <w:left w:type="dxa" w:w="70"/>
+              <w:bottom w:type="dxa" w:w="50"/>
+              <w:right w:type="dxa" w:w="70"/>
+            </w:tcMar>
+          </w:tcPr>
+          <w:p>
+            <w:pPr>
+              <w:jc w:val="left"/>
+            </w:pPr>
+            <w:r>
+              <w:rPr>
+                <w:rFonts w:ascii="Calibri" w:cs="Calibri" w:eastAsia="Calibri" w:hAnsi="Calibri"/>
+                <w:b/>
+                <w:bCs/>
+                <w:sz w:val="14"/>
+                <w:szCs w:val="14"/>
+              </w:rPr>
+              <w:t xml:space="preserve">Family Tether</w:t>
+            </w:r>
+          </w:p>
+        </w:tc>
+        <w:tc>
+          <w:tcPr>
+            <w:tcW w:type="dxa" w:w="720"/>
+            <w:shd w:fill="E8E3DA" w:color="auto" w:val="clear"/>
+            <w:tcMar>
+              <w:top w:type="dxa" w:w="50"/>
+              <w:left w:type="dxa" w:w="70"/>
+              <w:bottom w:type="dxa" w:w="50"/>
+              <w:right w:type="dxa" w:w="70"/>
+            </w:tcMar>
+          </w:tcPr>
+          <w:p>
+            <w:pPr>
+              <w:jc w:val="left"/>
+            </w:pPr>
+            <w:r>
+              <w:rPr>
+                <w:rFonts w:ascii="Calibri" w:cs="Calibri" w:eastAsia="Calibri" w:hAnsi="Calibri"/>
+                <w:b/>
+                <w:bCs/>
+                <w:sz w:val="14"/>
+                <w:szCs w:val="14"/>
+              </w:rPr>
+              <w:t xml:space="preserve">Schools</w:t>
+            </w:r>
+          </w:p>
+        </w:tc>
+        <w:tc>
+          <w:tcPr>
+            <w:tcW w:type="dxa" w:w="760"/>
+            <w:shd w:fill="E8E3DA" w:color="auto" w:val="clear"/>
+            <w:tcMar>
+              <w:top w:type="dxa" w:w="50"/>
+              <w:left w:type="dxa" w:w="70"/>
+              <w:bottom w:type="dxa" w:w="50"/>
+              <w:right w:type="dxa" w:w="70"/>
+            </w:tcMar>
+          </w:tcPr>
+          <w:p>
+            <w:pPr>
+              <w:jc w:val="left"/>
+            </w:pPr>
+            <w:r>
+              <w:rPr>
+                <w:rFonts w:ascii="Calibri" w:cs="Calibri" w:eastAsia="Calibri" w:hAnsi="Calibri"/>
+                <w:b/>
+                <w:bCs/>
+                <w:sz w:val="14"/>
+                <w:szCs w:val="14"/>
+              </w:rPr>
+              <w:t xml:space="preserve">Gross</w:t>
+            </w:r>
+          </w:p>
+        </w:tc>
+        <w:tc>
+          <w:tcPr>
+            <w:tcW w:type="dxa" w:w="700"/>
+            <w:shd w:fill="E8E3DA" w:color="auto" w:val="clear"/>
+            <w:tcMar>
+              <w:top w:type="dxa" w:w="50"/>
+              <w:left w:type="dxa" w:w="70"/>
+              <w:bottom w:type="dxa" w:w="50"/>
+              <w:right w:type="dxa" w:w="70"/>
+            </w:tcMar>
+          </w:tcPr>
+          <w:p>
+            <w:pPr>
+              <w:jc w:val="left"/>
+            </w:pPr>
+            <w:r>
+              <w:rPr>
+                <w:rFonts w:ascii="Calibri" w:cs="Calibri" w:eastAsia="Calibri" w:hAnsi="Calibri"/>
+                <w:b/>
+                <w:bCs/>
+                <w:sz w:val="14"/>
+                <w:szCs w:val="14"/>
+              </w:rPr>
+              <w:t xml:space="preserve">Store fees</w:t>
+            </w:r>
+          </w:p>
+        </w:tc>
+        <w:tc>
+          <w:tcPr>
+            <w:tcW w:type="dxa" w:w="660"/>
+            <w:shd w:fill="E8E3DA" w:color="auto" w:val="clear"/>
+            <w:tcMar>
+              <w:top w:type="dxa" w:w="50"/>
+              <w:left w:type="dxa" w:w="70"/>
+              <w:bottom w:type="dxa" w:w="50"/>
+              <w:right w:type="dxa" w:w="70"/>
+            </w:tcMar>
+          </w:tcPr>
+          <w:p>
+            <w:pPr>
+              <w:jc w:val="left"/>
+            </w:pPr>
+            <w:r>
+              <w:rPr>
+                <w:rFonts w:ascii="Calibri" w:cs="Calibri" w:eastAsia="Calibri" w:hAnsi="Calibri"/>
+                <w:b/>
+                <w:bCs/>
+                <w:sz w:val="14"/>
+                <w:szCs w:val="14"/>
+              </w:rPr>
+              <w:t xml:space="preserve">RevenueCat</w:t>
+            </w:r>
+          </w:p>
+        </w:tc>
+        <w:tc>
+          <w:tcPr>
+            <w:tcW w:type="dxa" w:w="620"/>
+            <w:shd w:fill="E8E3DA" w:color="auto" w:val="clear"/>
+            <w:tcMar>
+              <w:top w:type="dxa" w:w="50"/>
+              <w:left w:type="dxa" w:w="70"/>
+              <w:bottom w:type="dxa" w:w="50"/>
+              <w:right w:type="dxa" w:w="70"/>
+            </w:tcMar>
+          </w:tcPr>
+          <w:p>
+            <w:pPr>
+              <w:jc w:val="left"/>
+            </w:pPr>
+            <w:r>
+              <w:rPr>
+                <w:rFonts w:ascii="Calibri" w:cs="Calibri" w:eastAsia="Calibri" w:hAnsi="Calibri"/>
+                <w:b/>
+                <w:bCs/>
+                <w:sz w:val="14"/>
+                <w:szCs w:val="14"/>
+              </w:rPr>
+              <w:t xml:space="preserve">Refunds</w:t>
+            </w:r>
+          </w:p>
+        </w:tc>
+        <w:tc>
+          <w:tcPr>
+            <w:tcW w:type="dxa" w:w="700"/>
+            <w:shd w:fill="E8E3DA" w:color="auto" w:val="clear"/>
+            <w:tcMar>
+              <w:top w:type="dxa" w:w="50"/>
+              <w:left w:type="dxa" w:w="70"/>
+              <w:bottom w:type="dxa" w:w="50"/>
+              <w:right w:type="dxa" w:w="70"/>
+            </w:tcMar>
+          </w:tcPr>
+          <w:p>
+            <w:pPr>
+              <w:jc w:val="left"/>
+            </w:pPr>
+            <w:r>
+              <w:rPr>
+                <w:rFonts w:ascii="Calibri" w:cs="Calibri" w:eastAsia="Calibri" w:hAnsi="Calibri"/>
+                <w:b/>
+                <w:bCs/>
+                <w:sz w:val="14"/>
+                <w:szCs w:val="14"/>
+              </w:rPr>
+              <w:t xml:space="preserve">Cloud, fixed</w:t>
+            </w:r>
+          </w:p>
+        </w:tc>
+        <w:tc>
+          <w:tcPr>
+            <w:tcW w:type="dxa" w:w="700"/>
+            <w:shd w:fill="E8E3DA" w:color="auto" w:val="clear"/>
+            <w:tcMar>
+              <w:top w:type="dxa" w:w="50"/>
+              <w:left w:type="dxa" w:w="70"/>
+              <w:bottom w:type="dxa" w:w="50"/>
+              <w:right w:type="dxa" w:w="70"/>
+            </w:tcMar>
+          </w:tcPr>
+          <w:p>
+            <w:pPr>
+              <w:jc w:val="left"/>
+            </w:pPr>
+            <w:r>
+              <w:rPr>
+                <w:rFonts w:ascii="Calibri" w:cs="Calibri" w:eastAsia="Calibri" w:hAnsi="Calibri"/>
+                <w:b/>
+                <w:bCs/>
+                <w:sz w:val="14"/>
+                <w:szCs w:val="14"/>
+              </w:rPr>
+              <w:t xml:space="preserve">Acquisition</w:t>
+            </w:r>
+          </w:p>
+        </w:tc>
+        <w:tc>
+          <w:tcPr>
+            <w:tcW w:type="dxa" w:w="700"/>
+            <w:shd w:fill="E8E3DA" w:color="auto" w:val="clear"/>
+            <w:tcMar>
+              <w:top w:type="dxa" w:w="50"/>
+              <w:left w:type="dxa" w:w="70"/>
+              <w:bottom w:type="dxa" w:w="50"/>
+              <w:right w:type="dxa" w:w="70"/>
+            </w:tcMar>
+          </w:tcPr>
+          <w:p>
+            <w:pPr>
+              <w:jc w:val="left"/>
+            </w:pPr>
+            <w:r>
+              <w:rPr>
+                <w:rFonts w:ascii="Calibri" w:cs="Calibri" w:eastAsia="Calibri" w:hAnsi="Calibri"/>
+                <w:b/>
+                <w:bCs/>
+                <w:sz w:val="14"/>
+                <w:szCs w:val="14"/>
+              </w:rPr>
+              <w:t xml:space="preserve">Operating</w:t>
+            </w:r>
+          </w:p>
+        </w:tc>
+        <w:tc>
+          <w:tcPr>
+            <w:tcW w:type="dxa" w:w="720"/>
+            <w:shd w:fill="E8E3DA" w:color="auto" w:val="clear"/>
+            <w:tcMar>
+              <w:top w:type="dxa" w:w="50"/>
+              <w:left w:type="dxa" w:w="70"/>
+              <w:bottom w:type="dxa" w:w="50"/>
+              <w:right w:type="dxa" w:w="70"/>
+            </w:tcMar>
+          </w:tcPr>
+          <w:p>
+            <w:pPr>
+              <w:jc w:val="left"/>
+            </w:pPr>
+            <w:r>
+              <w:rPr>
+                <w:rFonts w:ascii="Calibri" w:cs="Calibri" w:eastAsia="Calibri" w:hAnsi="Calibri"/>
+                <w:b/>
+                <w:bCs/>
+                <w:sz w:val="14"/>
+                <w:szCs w:val="14"/>
+              </w:rPr>
+              <w:t xml:space="preserve">Net</w:t>
+            </w:r>
+          </w:p>
+        </w:tc>
+        <w:tc>
+          <w:tcPr>
+            <w:tcW w:type="dxa" w:w="800"/>
+            <w:shd w:fill="E8E3DA" w:color="auto" w:val="clear"/>
+            <w:tcMar>
+              <w:top w:type="dxa" w:w="50"/>
+              <w:left w:type="dxa" w:w="70"/>
+              <w:bottom w:type="dxa" w:w="50"/>
+              <w:right w:type="dxa" w:w="70"/>
+            </w:tcMar>
+          </w:tcPr>
+          <w:p>
+            <w:pPr>
+              <w:jc w:val="left"/>
+            </w:pPr>
+            <w:r>
+              <w:rPr>
+                <w:rFonts w:ascii="Calibri" w:cs="Calibri" w:eastAsia="Calibri" w:hAnsi="Calibri"/>
+                <w:b/>
+                <w:bCs/>
+                <w:sz w:val="14"/>
+                <w:szCs w:val="14"/>
+              </w:rPr>
+              <w:t xml:space="preserve">Cumulative</w:t>
+            </w:r>
+          </w:p>
+        </w:tc>
+      </w:tr>
+      <w:tr>
+        <w:tc>
+          <w:tcPr>
+            <w:tcW w:type="dxa" w:w="520"/>
+            <w:tcMar>
+              <w:top w:type="dxa" w:w="50"/>
+              <w:left w:type="dxa" w:w="70"/>
+              <w:bottom w:type="dxa" w:w="50"/>
+              <w:right w:type="dxa" w:w="70"/>
+            </w:tcMar>
+          </w:tcPr>
+          <w:p>
+            <w:pPr>
+              <w:jc w:val="left"/>
+            </w:pPr>
+            <w:r>
+              <w:rPr>
+                <w:rFonts w:ascii="Calibri" w:cs="Calibri" w:eastAsia="Calibri" w:hAnsi="Calibri"/>
+                <w:b w:val="false"/>
+                <w:bCs w:val="false"/>
+                <w:sz w:val="14"/>
+                <w:szCs w:val="14"/>
+              </w:rPr>
+              <w:t xml:space="preserve">1</w:t>
+            </w:r>
+          </w:p>
+        </w:tc>
+        <w:tc>
+          <w:tcPr>
+            <w:tcW w:type="dxa" w:w="560"/>
+            <w:tcMar>
+              <w:top w:type="dxa" w:w="50"/>
+              <w:left w:type="dxa" w:w="70"/>
+              <w:bottom w:type="dxa" w:w="50"/>
+              <w:right w:type="dxa" w:w="70"/>
+            </w:tcMar>
+          </w:tcPr>
+          <w:p>
+            <w:pPr>
+              <w:jc w:val="right"/>
+            </w:pPr>
+            <w:r>
+              <w:rPr>
+                <w:rFonts w:ascii="Calibri" w:cs="Calibri" w:eastAsia="Calibri" w:hAnsi="Calibri"/>
+                <w:b w:val="false"/>
+                <w:bCs w:val="false"/>
+                <w:sz w:val="14"/>
+                <w:szCs w:val="14"/>
+              </w:rPr>
+              <w:t xml:space="preserve">2,400</w:t>
+            </w:r>
+          </w:p>
+        </w:tc>
+        <w:tc>
+          <w:tcPr>
+            <w:tcW w:type="dxa" w:w="560"/>
+            <w:tcMar>
+              <w:top w:type="dxa" w:w="50"/>
+              <w:left w:type="dxa" w:w="70"/>
+              <w:bottom w:type="dxa" w:w="50"/>
+              <w:right w:type="dxa" w:w="70"/>
+            </w:tcMar>
+          </w:tcPr>
+          <w:p>
+            <w:pPr>
+              <w:jc w:val="right"/>
+            </w:pPr>
+            <w:r>
+              <w:rPr>
+                <w:rFonts w:ascii="Calibri" w:cs="Calibri" w:eastAsia="Calibri" w:hAnsi="Calibri"/>
+                <w:b w:val="false"/>
+                <w:bCs w:val="false"/>
+                <w:sz w:val="14"/>
+                <w:szCs w:val="14"/>
+              </w:rPr>
+              <w:t xml:space="preserve">450</w:t>
+            </w:r>
+          </w:p>
+        </w:tc>
+        <w:tc>
+          <w:tcPr>
+            <w:tcW w:type="dxa" w:w="560"/>
+            <w:tcMar>
+              <w:top w:type="dxa" w:w="50"/>
+              <w:left w:type="dxa" w:w="70"/>
+              <w:bottom w:type="dxa" w:w="50"/>
+              <w:right w:type="dxa" w:w="70"/>
+            </w:tcMar>
+          </w:tcPr>
+          <w:p>
+            <w:pPr>
+              <w:jc w:val="right"/>
+            </w:pPr>
+            <w:r>
+              <w:rPr>
+                <w:rFonts w:ascii="Calibri" w:cs="Calibri" w:eastAsia="Calibri" w:hAnsi="Calibri"/>
+                <w:b w:val="false"/>
+                <w:bCs w:val="false"/>
+                <w:sz w:val="14"/>
+                <w:szCs w:val="14"/>
+              </w:rPr>
+              <w:t xml:space="preserve">225</w:t>
+            </w:r>
+          </w:p>
+        </w:tc>
+        <w:tc>
+          <w:tcPr>
+            <w:tcW w:type="dxa" w:w="900"/>
+            <w:tcMar>
+              <w:top w:type="dxa" w:w="50"/>
+              <w:left w:type="dxa" w:w="70"/>
+              <w:bottom w:type="dxa" w:w="50"/>
+              <w:right w:type="dxa" w:w="70"/>
+            </w:tcMar>
+          </w:tcPr>
+          <w:p>
+            <w:pPr>
+              <w:jc w:val="right"/>
+            </w:pPr>
+            <w:r>
+              <w:rPr>
+                <w:rFonts w:ascii="Calibri" w:cs="Calibri" w:eastAsia="Calibri" w:hAnsi="Calibri"/>
+                <w:b w:val="false"/>
+                <w:bCs w:val="false"/>
+                <w:sz w:val="14"/>
+                <w:szCs w:val="14"/>
+              </w:rPr>
+              <w:t xml:space="preserve">0, 0</w:t>
+            </w:r>
+          </w:p>
+        </w:tc>
+        <w:tc>
+          <w:tcPr>
+            <w:tcW w:type="dxa" w:w="720"/>
+            <w:tcMar>
+              <w:top w:type="dxa" w:w="50"/>
+              <w:left w:type="dxa" w:w="70"/>
+              <w:bottom w:type="dxa" w:w="50"/>
+              <w:right w:type="dxa" w:w="70"/>
+            </w:tcMar>
+          </w:tcPr>
+          <w:p>
+            <w:pPr>
+              <w:jc w:val="right"/>
+            </w:pPr>
+            <w:r>
+              <w:rPr>
+                <w:rFonts w:ascii="Calibri" w:cs="Calibri" w:eastAsia="Calibri" w:hAnsi="Calibri"/>
+                <w:b w:val="false"/>
+                <w:bCs w:val="false"/>
+                <w:sz w:val="14"/>
+                <w:szCs w:val="14"/>
+              </w:rPr>
+              <w:t xml:space="preserve">$239,976</w:t>
+            </w:r>
+          </w:p>
+        </w:tc>
+        <w:tc>
+          <w:tcPr>
+            <w:tcW w:type="dxa" w:w="760"/>
+            <w:tcMar>
+              <w:top w:type="dxa" w:w="50"/>
+              <w:left w:type="dxa" w:w="70"/>
+              <w:bottom w:type="dxa" w:w="50"/>
+              <w:right w:type="dxa" w:w="70"/>
+            </w:tcMar>
+          </w:tcPr>
+          <w:p>
+            <w:pPr>
+              <w:jc w:val="right"/>
+            </w:pPr>
+            <w:r>
+              <w:rPr>
+                <w:rFonts w:ascii="Calibri" w:cs="Calibri" w:eastAsia="Calibri" w:hAnsi="Calibri"/>
+                <w:b w:val="false"/>
+                <w:bCs w:val="false"/>
+                <w:sz w:val="14"/>
+                <w:szCs w:val="14"/>
+              </w:rPr>
+              <w:t xml:space="preserve">$26,973</w:t>
+            </w:r>
+          </w:p>
+        </w:tc>
+        <w:tc>
+          <w:tcPr>
+            <w:tcW w:type="dxa" w:w="720"/>
+            <w:tcMar>
+              <w:top w:type="dxa" w:w="50"/>
+              <w:left w:type="dxa" w:w="70"/>
+              <w:bottom w:type="dxa" w:w="50"/>
+              <w:right w:type="dxa" w:w="70"/>
+            </w:tcMar>
+          </w:tcPr>
+          <w:p>
+            <w:pPr>
+              <w:jc w:val="right"/>
+            </w:pPr>
+            <w:r>
+              <w:rPr>
+                <w:rFonts w:ascii="Calibri" w:cs="Calibri" w:eastAsia="Calibri" w:hAnsi="Calibri"/>
+                <w:b w:val="false"/>
+                <w:bCs w:val="false"/>
+                <w:sz w:val="14"/>
+                <w:szCs w:val="14"/>
+              </w:rPr>
+              <w:t xml:space="preserve">$0</w:t>
+            </w:r>
+          </w:p>
+        </w:tc>
+        <w:tc>
+          <w:tcPr>
+            <w:tcW w:type="dxa" w:w="760"/>
+            <w:tcMar>
+              <w:top w:type="dxa" w:w="50"/>
+              <w:left w:type="dxa" w:w="70"/>
+              <w:bottom w:type="dxa" w:w="50"/>
+              <w:right w:type="dxa" w:w="70"/>
+            </w:tcMar>
+          </w:tcPr>
+          <w:p>
+            <w:pPr>
+              <w:jc w:val="right"/>
+            </w:pPr>
+            <w:r>
+              <w:rPr>
+                <w:rFonts w:ascii="Calibri" w:cs="Calibri" w:eastAsia="Calibri" w:hAnsi="Calibri"/>
+                <w:b w:val="false"/>
+                <w:bCs w:val="false"/>
+                <w:sz w:val="14"/>
+                <w:szCs w:val="14"/>
+              </w:rPr>
+              <w:t xml:space="preserve">$266,949</w:t>
+            </w:r>
+          </w:p>
+        </w:tc>
+        <w:tc>
+          <w:tcPr>
+            <w:tcW w:type="dxa" w:w="700"/>
+            <w:tcMar>
+              <w:top w:type="dxa" w:w="50"/>
+              <w:left w:type="dxa" w:w="70"/>
+              <w:bottom w:type="dxa" w:w="50"/>
+              <w:right w:type="dxa" w:w="70"/>
+            </w:tcMar>
+          </w:tcPr>
+          <w:p>
+            <w:pPr>
+              <w:jc w:val="right"/>
+            </w:pPr>
+            <w:r>
+              <w:rPr>
+                <w:rFonts w:ascii="Calibri" w:cs="Calibri" w:eastAsia="Calibri" w:hAnsi="Calibri"/>
+                <w:b w:val="false"/>
+                <w:bCs w:val="false"/>
+                <w:sz w:val="14"/>
+                <w:szCs w:val="14"/>
+              </w:rPr>
+              <w:t xml:space="preserve">($40,042)</w:t>
+            </w:r>
+          </w:p>
+        </w:tc>
+        <w:tc>
+          <w:tcPr>
+            <w:tcW w:type="dxa" w:w="660"/>
+            <w:tcMar>
+              <w:top w:type="dxa" w:w="50"/>
+              <w:left w:type="dxa" w:w="70"/>
+              <w:bottom w:type="dxa" w:w="50"/>
+              <w:right w:type="dxa" w:w="70"/>
+            </w:tcMar>
+          </w:tcPr>
+          <w:p>
+            <w:pPr>
+              <w:jc w:val="right"/>
+            </w:pPr>
+            <w:r>
+              <w:rPr>
+                <w:rFonts w:ascii="Calibri" w:cs="Calibri" w:eastAsia="Calibri" w:hAnsi="Calibri"/>
+                <w:b w:val="false"/>
+                <w:bCs w:val="false"/>
+                <w:sz w:val="14"/>
+                <w:szCs w:val="14"/>
+              </w:rPr>
+              <w:t xml:space="preserve">($2,669)</w:t>
+            </w:r>
+          </w:p>
+        </w:tc>
+        <w:tc>
+          <w:tcPr>
+            <w:tcW w:type="dxa" w:w="620"/>
+            <w:tcMar>
+              <w:top w:type="dxa" w:w="50"/>
+              <w:left w:type="dxa" w:w="70"/>
+              <w:bottom w:type="dxa" w:w="50"/>
+              <w:right w:type="dxa" w:w="70"/>
+            </w:tcMar>
+          </w:tcPr>
+          <w:p>
+            <w:pPr>
+              <w:jc w:val="right"/>
+            </w:pPr>
+            <w:r>
+              <w:rPr>
+                <w:rFonts w:ascii="Calibri" w:cs="Calibri" w:eastAsia="Calibri" w:hAnsi="Calibri"/>
+                <w:b w:val="false"/>
+                <w:bCs w:val="false"/>
+                <w:sz w:val="14"/>
+                <w:szCs w:val="14"/>
+              </w:rPr>
+              <w:t xml:space="preserve">($10,678)</w:t>
+            </w:r>
+          </w:p>
+        </w:tc>
+        <w:tc>
+          <w:tcPr>
+            <w:tcW w:type="dxa" w:w="700"/>
+            <w:tcMar>
+              <w:top w:type="dxa" w:w="50"/>
+              <w:left w:type="dxa" w:w="70"/>
+              <w:bottom w:type="dxa" w:w="50"/>
+              <w:right w:type="dxa" w:w="70"/>
+            </w:tcMar>
+          </w:tcPr>
+          <w:p>
+            <w:pPr>
+              <w:jc w:val="right"/>
+            </w:pPr>
+            <w:r>
+              <w:rPr>
+                <w:rFonts w:ascii="Calibri" w:cs="Calibri" w:eastAsia="Calibri" w:hAnsi="Calibri"/>
+                <w:b w:val="false"/>
+                <w:bCs w:val="false"/>
+                <w:sz w:val="14"/>
+                <w:szCs w:val="14"/>
+              </w:rPr>
+              <w:t xml:space="preserve">($1,884)</w:t>
+            </w:r>
+          </w:p>
+        </w:tc>
+        <w:tc>
+          <w:tcPr>
+            <w:tcW w:type="dxa" w:w="700"/>
+            <w:tcMar>
+              <w:top w:type="dxa" w:w="50"/>
+              <w:left w:type="dxa" w:w="70"/>
+              <w:bottom w:type="dxa" w:w="50"/>
+              <w:right w:type="dxa" w:w="70"/>
+            </w:tcMar>
+          </w:tcPr>
+          <w:p>
+            <w:pPr>
+              <w:jc w:val="right"/>
+            </w:pPr>
+            <w:r>
+              <w:rPr>
+                <w:rFonts w:ascii="Calibri" w:cs="Calibri" w:eastAsia="Calibri" w:hAnsi="Calibri"/>
+                <w:b w:val="false"/>
+                <w:bCs w:val="false"/>
+                <w:sz w:val="14"/>
+                <w:szCs w:val="14"/>
+              </w:rPr>
+              <w:t xml:space="preserve">($28,800)</w:t>
+            </w:r>
+          </w:p>
+        </w:tc>
+        <w:tc>
+          <w:tcPr>
+            <w:tcW w:type="dxa" w:w="700"/>
+            <w:tcMar>
+              <w:top w:type="dxa" w:w="50"/>
+              <w:left w:type="dxa" w:w="70"/>
+              <w:bottom w:type="dxa" w:w="50"/>
+              <w:right w:type="dxa" w:w="70"/>
+            </w:tcMar>
+          </w:tcPr>
+          <w:p>
+            <w:pPr>
+              <w:jc w:val="right"/>
+            </w:pPr>
+            <w:r>
+              <w:rPr>
+                <w:rFonts w:ascii="Calibri" w:cs="Calibri" w:eastAsia="Calibri" w:hAnsi="Calibri"/>
+                <w:b w:val="false"/>
+                <w:bCs w:val="false"/>
+                <w:sz w:val="14"/>
+                <w:szCs w:val="14"/>
+              </w:rPr>
+              <w:t xml:space="preserve">($34,500)</w:t>
+            </w:r>
+          </w:p>
+        </w:tc>
+        <w:tc>
+          <w:tcPr>
+            <w:tcW w:type="dxa" w:w="720"/>
+            <w:tcMar>
+              <w:top w:type="dxa" w:w="50"/>
+              <w:left w:type="dxa" w:w="70"/>
+              <w:bottom w:type="dxa" w:w="50"/>
+              <w:right w:type="dxa" w:w="70"/>
+            </w:tcMar>
+          </w:tcPr>
+          <w:p>
+            <w:pPr>
+              <w:jc w:val="right"/>
+            </w:pPr>
+            <w:r>
+              <w:rPr>
+                <w:rFonts w:ascii="Calibri" w:cs="Calibri" w:eastAsia="Calibri" w:hAnsi="Calibri"/>
+                <w:b w:val="false"/>
+                <w:bCs w:val="false"/>
+                <w:sz w:val="14"/>
+                <w:szCs w:val="14"/>
+              </w:rPr>
+              <w:t xml:space="preserve">$148,375</w:t>
+            </w:r>
+          </w:p>
+        </w:tc>
+        <w:tc>
+          <w:tcPr>
+            <w:tcW w:type="dxa" w:w="800"/>
+            <w:tcMar>
+              <w:top w:type="dxa" w:w="50"/>
+              <w:left w:type="dxa" w:w="70"/>
+              <w:bottom w:type="dxa" w:w="50"/>
+              <w:right w:type="dxa" w:w="70"/>
+            </w:tcMar>
+          </w:tcPr>
+          <w:p>
+            <w:pPr>
+              <w:jc w:val="right"/>
+            </w:pPr>
+            <w:r>
+              <w:rPr>
+                <w:rFonts w:ascii="Calibri" w:cs="Calibri" w:eastAsia="Calibri" w:hAnsi="Calibri"/>
+                <w:b w:val="false"/>
+                <w:bCs w:val="false"/>
+                <w:sz w:val="14"/>
+                <w:szCs w:val="14"/>
+              </w:rPr>
+              <w:t xml:space="preserve">$148,375</w:t>
+            </w:r>
+          </w:p>
+        </w:tc>
+      </w:tr>
+      <w:tr>
+        <w:tc>
+          <w:tcPr>
+            <w:tcW w:type="dxa" w:w="520"/>
+            <w:tcMar>
+              <w:top w:type="dxa" w:w="50"/>
+              <w:left w:type="dxa" w:w="70"/>
+              <w:bottom w:type="dxa" w:w="50"/>
+              <w:right w:type="dxa" w:w="70"/>
+            </w:tcMar>
+          </w:tcPr>
+          <w:p>
+            <w:pPr>
+              <w:jc w:val="left"/>
+            </w:pPr>
+            <w:r>
+              <w:rPr>
+                <w:rFonts w:ascii="Calibri" w:cs="Calibri" w:eastAsia="Calibri" w:hAnsi="Calibri"/>
+                <w:b w:val="false"/>
+                <w:bCs w:val="false"/>
+                <w:sz w:val="14"/>
+                <w:szCs w:val="14"/>
+              </w:rPr>
+              <w:t xml:space="preserve">2</w:t>
+            </w:r>
+          </w:p>
+        </w:tc>
+        <w:tc>
+          <w:tcPr>
+            <w:tcW w:type="dxa" w:w="560"/>
+            <w:tcMar>
+              <w:top w:type="dxa" w:w="50"/>
+              <w:left w:type="dxa" w:w="70"/>
+              <w:bottom w:type="dxa" w:w="50"/>
+              <w:right w:type="dxa" w:w="70"/>
+            </w:tcMar>
+          </w:tcPr>
+          <w:p>
+            <w:pPr>
+              <w:jc w:val="right"/>
+            </w:pPr>
+            <w:r>
+              <w:rPr>
+                <w:rFonts w:ascii="Calibri" w:cs="Calibri" w:eastAsia="Calibri" w:hAnsi="Calibri"/>
+                <w:b w:val="false"/>
+                <w:bCs w:val="false"/>
+                <w:sz w:val="14"/>
+                <w:szCs w:val="14"/>
+              </w:rPr>
+              <w:t xml:space="preserve">5,500</w:t>
+            </w:r>
+          </w:p>
+        </w:tc>
+        <w:tc>
+          <w:tcPr>
+            <w:tcW w:type="dxa" w:w="560"/>
+            <w:tcMar>
+              <w:top w:type="dxa" w:w="50"/>
+              <w:left w:type="dxa" w:w="70"/>
+              <w:bottom w:type="dxa" w:w="50"/>
+              <w:right w:type="dxa" w:w="70"/>
+            </w:tcMar>
+          </w:tcPr>
+          <w:p>
+            <w:pPr>
+              <w:jc w:val="right"/>
+            </w:pPr>
+            <w:r>
+              <w:rPr>
+                <w:rFonts w:ascii="Calibri" w:cs="Calibri" w:eastAsia="Calibri" w:hAnsi="Calibri"/>
+                <w:b w:val="false"/>
+                <w:bCs w:val="false"/>
+                <w:sz w:val="14"/>
+                <w:szCs w:val="14"/>
+              </w:rPr>
+              <w:t xml:space="preserve">1,450</w:t>
+            </w:r>
+          </w:p>
+        </w:tc>
+        <w:tc>
+          <w:tcPr>
+            <w:tcW w:type="dxa" w:w="560"/>
+            <w:tcMar>
+              <w:top w:type="dxa" w:w="50"/>
+              <w:left w:type="dxa" w:w="70"/>
+              <w:bottom w:type="dxa" w:w="50"/>
+              <w:right w:type="dxa" w:w="70"/>
+            </w:tcMar>
+          </w:tcPr>
+          <w:p>
+            <w:pPr>
+              <w:jc w:val="right"/>
+            </w:pPr>
+            <w:r>
+              <w:rPr>
+                <w:rFonts w:ascii="Calibri" w:cs="Calibri" w:eastAsia="Calibri" w:hAnsi="Calibri"/>
+                <w:b w:val="false"/>
+                <w:bCs w:val="false"/>
+                <w:sz w:val="14"/>
+                <w:szCs w:val="14"/>
+              </w:rPr>
+              <w:t xml:space="preserve">950</w:t>
+            </w:r>
+          </w:p>
+        </w:tc>
+        <w:tc>
+          <w:tcPr>
+            <w:tcW w:type="dxa" w:w="900"/>
+            <w:tcMar>
+              <w:top w:type="dxa" w:w="50"/>
+              <w:left w:type="dxa" w:w="70"/>
+              <w:bottom w:type="dxa" w:w="50"/>
+              <w:right w:type="dxa" w:w="70"/>
+            </w:tcMar>
+          </w:tcPr>
+          <w:p>
+            <w:pPr>
+              <w:jc w:val="right"/>
+            </w:pPr>
+            <w:r>
+              <w:rPr>
+                <w:rFonts w:ascii="Calibri" w:cs="Calibri" w:eastAsia="Calibri" w:hAnsi="Calibri"/>
+                <w:b w:val="false"/>
+                <w:bCs w:val="false"/>
+                <w:sz w:val="14"/>
+                <w:szCs w:val="14"/>
+              </w:rPr>
+              <w:t xml:space="preserve">12, 480 (15, 150)</w:t>
+            </w:r>
+          </w:p>
+        </w:tc>
+        <w:tc>
+          <w:tcPr>
+            <w:tcW w:type="dxa" w:w="720"/>
+            <w:tcMar>
+              <w:top w:type="dxa" w:w="50"/>
+              <w:left w:type="dxa" w:w="70"/>
+              <w:bottom w:type="dxa" w:w="50"/>
+              <w:right w:type="dxa" w:w="70"/>
+            </w:tcMar>
+          </w:tcPr>
+          <w:p>
+            <w:pPr>
+              <w:jc w:val="right"/>
+            </w:pPr>
+            <w:r>
+              <w:rPr>
+                <w:rFonts w:ascii="Calibri" w:cs="Calibri" w:eastAsia="Calibri" w:hAnsi="Calibri"/>
+                <w:b w:val="false"/>
+                <w:bCs w:val="false"/>
+                <w:sz w:val="14"/>
+                <w:szCs w:val="14"/>
+              </w:rPr>
+              <w:t xml:space="preserve">$549,945</w:t>
+            </w:r>
+          </w:p>
+        </w:tc>
+        <w:tc>
+          <w:tcPr>
+            <w:tcW w:type="dxa" w:w="760"/>
+            <w:tcMar>
+              <w:top w:type="dxa" w:w="50"/>
+              <w:left w:type="dxa" w:w="70"/>
+              <w:bottom w:type="dxa" w:w="50"/>
+              <w:right w:type="dxa" w:w="70"/>
+            </w:tcMar>
+          </w:tcPr>
+          <w:p>
+            <w:pPr>
+              <w:jc w:val="right"/>
+            </w:pPr>
+            <w:r>
+              <w:rPr>
+                <w:rFonts w:ascii="Calibri" w:cs="Calibri" w:eastAsia="Calibri" w:hAnsi="Calibri"/>
+                <w:b w:val="false"/>
+                <w:bCs w:val="false"/>
+                <w:sz w:val="14"/>
+                <w:szCs w:val="14"/>
+              </w:rPr>
+              <w:t xml:space="preserve">$113,886</w:t>
+            </w:r>
+          </w:p>
+        </w:tc>
+        <w:tc>
+          <w:tcPr>
+            <w:tcW w:type="dxa" w:w="720"/>
+            <w:tcMar>
+              <w:top w:type="dxa" w:w="50"/>
+              <w:left w:type="dxa" w:w="70"/>
+              <w:bottom w:type="dxa" w:w="50"/>
+              <w:right w:type="dxa" w:w="70"/>
+            </w:tcMar>
+          </w:tcPr>
+          <w:p>
+            <w:pPr>
+              <w:jc w:val="right"/>
+            </w:pPr>
+            <w:r>
+              <w:rPr>
+                <w:rFonts w:ascii="Calibri" w:cs="Calibri" w:eastAsia="Calibri" w:hAnsi="Calibri"/>
+                <w:b w:val="false"/>
+                <w:bCs w:val="false"/>
+                <w:sz w:val="14"/>
+                <w:szCs w:val="14"/>
+              </w:rPr>
+              <w:t xml:space="preserve">$78,744</w:t>
+            </w:r>
+          </w:p>
+        </w:tc>
+        <w:tc>
+          <w:tcPr>
+            <w:tcW w:type="dxa" w:w="760"/>
+            <w:tcMar>
+              <w:top w:type="dxa" w:w="50"/>
+              <w:left w:type="dxa" w:w="70"/>
+              <w:bottom w:type="dxa" w:w="50"/>
+              <w:right w:type="dxa" w:w="70"/>
+            </w:tcMar>
+          </w:tcPr>
+          <w:p>
+            <w:pPr>
+              <w:jc w:val="right"/>
+            </w:pPr>
+            <w:r>
+              <w:rPr>
+                <w:rFonts w:ascii="Calibri" w:cs="Calibri" w:eastAsia="Calibri" w:hAnsi="Calibri"/>
+                <w:b w:val="false"/>
+                <w:bCs w:val="false"/>
+                <w:sz w:val="14"/>
+                <w:szCs w:val="14"/>
+              </w:rPr>
+              <w:t xml:space="preserve">$742,575</w:t>
+            </w:r>
+          </w:p>
+        </w:tc>
+        <w:tc>
+          <w:tcPr>
+            <w:tcW w:type="dxa" w:w="700"/>
+            <w:tcMar>
+              <w:top w:type="dxa" w:w="50"/>
+              <w:left w:type="dxa" w:w="70"/>
+              <w:bottom w:type="dxa" w:w="50"/>
+              <w:right w:type="dxa" w:w="70"/>
+            </w:tcMar>
+          </w:tcPr>
+          <w:p>
+            <w:pPr>
+              <w:jc w:val="right"/>
+            </w:pPr>
+            <w:r>
+              <w:rPr>
+                <w:rFonts w:ascii="Calibri" w:cs="Calibri" w:eastAsia="Calibri" w:hAnsi="Calibri"/>
+                <w:b w:val="false"/>
+                <w:bCs w:val="false"/>
+                <w:sz w:val="14"/>
+                <w:szCs w:val="14"/>
+              </w:rPr>
+              <w:t xml:space="preserve">($111,386)</w:t>
+            </w:r>
+          </w:p>
+        </w:tc>
+        <w:tc>
+          <w:tcPr>
+            <w:tcW w:type="dxa" w:w="660"/>
+            <w:tcMar>
+              <w:top w:type="dxa" w:w="50"/>
+              <w:left w:type="dxa" w:w="70"/>
+              <w:bottom w:type="dxa" w:w="50"/>
+              <w:right w:type="dxa" w:w="70"/>
+            </w:tcMar>
+          </w:tcPr>
+          <w:p>
+            <w:pPr>
+              <w:jc w:val="right"/>
+            </w:pPr>
+            <w:r>
+              <w:rPr>
+                <w:rFonts w:ascii="Calibri" w:cs="Calibri" w:eastAsia="Calibri" w:hAnsi="Calibri"/>
+                <w:b w:val="false"/>
+                <w:bCs w:val="false"/>
+                <w:sz w:val="14"/>
+                <w:szCs w:val="14"/>
+              </w:rPr>
+              <w:t xml:space="preserve">($6,638)</w:t>
+            </w:r>
+          </w:p>
+        </w:tc>
+        <w:tc>
+          <w:tcPr>
+            <w:tcW w:type="dxa" w:w="620"/>
+            <w:tcMar>
+              <w:top w:type="dxa" w:w="50"/>
+              <w:left w:type="dxa" w:w="70"/>
+              <w:bottom w:type="dxa" w:w="50"/>
+              <w:right w:type="dxa" w:w="70"/>
+            </w:tcMar>
+          </w:tcPr>
+          <w:p>
+            <w:pPr>
+              <w:jc w:val="right"/>
+            </w:pPr>
+            <w:r>
+              <w:rPr>
+                <w:rFonts w:ascii="Calibri" w:cs="Calibri" w:eastAsia="Calibri" w:hAnsi="Calibri"/>
+                <w:b w:val="false"/>
+                <w:bCs w:val="false"/>
+                <w:sz w:val="14"/>
+                <w:szCs w:val="14"/>
+              </w:rPr>
+              <w:t xml:space="preserve">($26,553)</w:t>
+            </w:r>
+          </w:p>
+        </w:tc>
+        <w:tc>
+          <w:tcPr>
+            <w:tcW w:type="dxa" w:w="700"/>
+            <w:tcMar>
+              <w:top w:type="dxa" w:w="50"/>
+              <w:left w:type="dxa" w:w="70"/>
+              <w:bottom w:type="dxa" w:w="50"/>
+              <w:right w:type="dxa" w:w="70"/>
+            </w:tcMar>
+          </w:tcPr>
+          <w:p>
+            <w:pPr>
+              <w:jc w:val="right"/>
+            </w:pPr>
+            <w:r>
+              <w:rPr>
+                <w:rFonts w:ascii="Calibri" w:cs="Calibri" w:eastAsia="Calibri" w:hAnsi="Calibri"/>
+                <w:b w:val="false"/>
+                <w:bCs w:val="false"/>
+                <w:sz w:val="14"/>
+                <w:szCs w:val="14"/>
+              </w:rPr>
+              <w:t xml:space="preserve">($6,385)</w:t>
+            </w:r>
+          </w:p>
+        </w:tc>
+        <w:tc>
+          <w:tcPr>
+            <w:tcW w:type="dxa" w:w="700"/>
+            <w:tcMar>
+              <w:top w:type="dxa" w:w="50"/>
+              <w:left w:type="dxa" w:w="70"/>
+              <w:bottom w:type="dxa" w:w="50"/>
+              <w:right w:type="dxa" w:w="70"/>
+            </w:tcMar>
+          </w:tcPr>
+          <w:p>
+            <w:pPr>
+              <w:jc w:val="right"/>
+            </w:pPr>
+            <w:r>
+              <w:rPr>
+                <w:rFonts w:ascii="Calibri" w:cs="Calibri" w:eastAsia="Calibri" w:hAnsi="Calibri"/>
+                <w:b w:val="false"/>
+                <w:bCs w:val="false"/>
+                <w:sz w:val="14"/>
+                <w:szCs w:val="14"/>
+              </w:rPr>
+              <w:t xml:space="preserve">($66,000)</w:t>
+            </w:r>
+          </w:p>
+        </w:tc>
+        <w:tc>
+          <w:tcPr>
+            <w:tcW w:type="dxa" w:w="700"/>
+            <w:tcMar>
+              <w:top w:type="dxa" w:w="50"/>
+              <w:left w:type="dxa" w:w="70"/>
+              <w:bottom w:type="dxa" w:w="50"/>
+              <w:right w:type="dxa" w:w="70"/>
+            </w:tcMar>
+          </w:tcPr>
+          <w:p>
+            <w:pPr>
+              <w:jc w:val="right"/>
+            </w:pPr>
+            <w:r>
+              <w:rPr>
+                <w:rFonts w:ascii="Calibri" w:cs="Calibri" w:eastAsia="Calibri" w:hAnsi="Calibri"/>
+                <w:b w:val="false"/>
+                <w:bCs w:val="false"/>
+                <w:sz w:val="14"/>
+                <w:szCs w:val="14"/>
+              </w:rPr>
+              <w:t xml:space="preserve">($53,700)</w:t>
+            </w:r>
+          </w:p>
+        </w:tc>
+        <w:tc>
+          <w:tcPr>
+            <w:tcW w:type="dxa" w:w="720"/>
+            <w:tcMar>
+              <w:top w:type="dxa" w:w="50"/>
+              <w:left w:type="dxa" w:w="70"/>
+              <w:bottom w:type="dxa" w:w="50"/>
+              <w:right w:type="dxa" w:w="70"/>
+            </w:tcMar>
+          </w:tcPr>
+          <w:p>
+            <w:pPr>
+              <w:jc w:val="right"/>
+            </w:pPr>
+            <w:r>
+              <w:rPr>
+                <w:rFonts w:ascii="Calibri" w:cs="Calibri" w:eastAsia="Calibri" w:hAnsi="Calibri"/>
+                <w:b w:val="false"/>
+                <w:bCs w:val="false"/>
+                <w:sz w:val="14"/>
+                <w:szCs w:val="14"/>
+              </w:rPr>
+              <w:t xml:space="preserve">$471,912</w:t>
+            </w:r>
+          </w:p>
+        </w:tc>
+        <w:tc>
+          <w:tcPr>
+            <w:tcW w:type="dxa" w:w="800"/>
+            <w:tcMar>
+              <w:top w:type="dxa" w:w="50"/>
+              <w:left w:type="dxa" w:w="70"/>
+              <w:bottom w:type="dxa" w:w="50"/>
+              <w:right w:type="dxa" w:w="70"/>
+            </w:tcMar>
+          </w:tcPr>
+          <w:p>
+            <w:pPr>
+              <w:jc w:val="right"/>
+            </w:pPr>
+            <w:r>
+              <w:rPr>
+                <w:rFonts w:ascii="Calibri" w:cs="Calibri" w:eastAsia="Calibri" w:hAnsi="Calibri"/>
+                <w:b w:val="false"/>
+                <w:bCs w:val="false"/>
+                <w:sz w:val="14"/>
+                <w:szCs w:val="14"/>
+              </w:rPr>
+              <w:t xml:space="preserve">$620,288</w:t>
+            </w:r>
+          </w:p>
+        </w:tc>
+      </w:tr>
+      <w:tr>
+        <w:tc>
+          <w:tcPr>
+            <w:tcW w:type="dxa" w:w="520"/>
+            <w:tcMar>
+              <w:top w:type="dxa" w:w="50"/>
+              <w:left w:type="dxa" w:w="70"/>
+              <w:bottom w:type="dxa" w:w="50"/>
+              <w:right w:type="dxa" w:w="70"/>
+            </w:tcMar>
+          </w:tcPr>
+          <w:p>
+            <w:pPr>
+              <w:jc w:val="left"/>
+            </w:pPr>
+            <w:r>
+              <w:rPr>
+                <w:rFonts w:ascii="Calibri" w:cs="Calibri" w:eastAsia="Calibri" w:hAnsi="Calibri"/>
+                <w:b w:val="false"/>
+                <w:bCs w:val="false"/>
+                <w:sz w:val="14"/>
+                <w:szCs w:val="14"/>
+              </w:rPr>
+              <w:t xml:space="preserve">3</w:t>
+            </w:r>
+          </w:p>
+        </w:tc>
+        <w:tc>
+          <w:tcPr>
+            <w:tcW w:type="dxa" w:w="560"/>
+            <w:tcMar>
+              <w:top w:type="dxa" w:w="50"/>
+              <w:left w:type="dxa" w:w="70"/>
+              <w:bottom w:type="dxa" w:w="50"/>
+              <w:right w:type="dxa" w:w="70"/>
+            </w:tcMar>
+          </w:tcPr>
+          <w:p>
+            <w:pPr>
+              <w:jc w:val="right"/>
+            </w:pPr>
+            <w:r>
+              <w:rPr>
+                <w:rFonts w:ascii="Calibri" w:cs="Calibri" w:eastAsia="Calibri" w:hAnsi="Calibri"/>
+                <w:b w:val="false"/>
+                <w:bCs w:val="false"/>
+                <w:sz w:val="14"/>
+                <w:szCs w:val="14"/>
+              </w:rPr>
+              <w:t xml:space="preserve">8,500</w:t>
+            </w:r>
+          </w:p>
+        </w:tc>
+        <w:tc>
+          <w:tcPr>
+            <w:tcW w:type="dxa" w:w="560"/>
+            <w:tcMar>
+              <w:top w:type="dxa" w:w="50"/>
+              <w:left w:type="dxa" w:w="70"/>
+              <w:bottom w:type="dxa" w:w="50"/>
+              <w:right w:type="dxa" w:w="70"/>
+            </w:tcMar>
+          </w:tcPr>
+          <w:p>
+            <w:pPr>
+              <w:jc w:val="right"/>
+            </w:pPr>
+            <w:r>
+              <w:rPr>
+                <w:rFonts w:ascii="Calibri" w:cs="Calibri" w:eastAsia="Calibri" w:hAnsi="Calibri"/>
+                <w:b w:val="false"/>
+                <w:bCs w:val="false"/>
+                <w:sz w:val="14"/>
+                <w:szCs w:val="14"/>
+              </w:rPr>
+              <w:t xml:space="preserve">2,900</w:t>
+            </w:r>
+          </w:p>
+        </w:tc>
+        <w:tc>
+          <w:tcPr>
+            <w:tcW w:type="dxa" w:w="560"/>
+            <w:tcMar>
+              <w:top w:type="dxa" w:w="50"/>
+              <w:left w:type="dxa" w:w="70"/>
+              <w:bottom w:type="dxa" w:w="50"/>
+              <w:right w:type="dxa" w:w="70"/>
+            </w:tcMar>
+          </w:tcPr>
+          <w:p>
+            <w:pPr>
+              <w:jc w:val="right"/>
+            </w:pPr>
+            <w:r>
+              <w:rPr>
+                <w:rFonts w:ascii="Calibri" w:cs="Calibri" w:eastAsia="Calibri" w:hAnsi="Calibri"/>
+                <w:b w:val="false"/>
+                <w:bCs w:val="false"/>
+                <w:sz w:val="14"/>
+                <w:szCs w:val="14"/>
+              </w:rPr>
+              <w:t xml:space="preserve">2,175</w:t>
+            </w:r>
+          </w:p>
+        </w:tc>
+        <w:tc>
+          <w:tcPr>
+            <w:tcW w:type="dxa" w:w="900"/>
+            <w:tcMar>
+              <w:top w:type="dxa" w:w="50"/>
+              <w:left w:type="dxa" w:w="70"/>
+              <w:bottom w:type="dxa" w:w="50"/>
+              <w:right w:type="dxa" w:w="70"/>
+            </w:tcMar>
+          </w:tcPr>
+          <w:p>
+            <w:pPr>
+              <w:jc w:val="right"/>
+            </w:pPr>
+            <w:r>
+              <w:rPr>
+                <w:rFonts w:ascii="Calibri" w:cs="Calibri" w:eastAsia="Calibri" w:hAnsi="Calibri"/>
+                <w:b w:val="false"/>
+                <w:bCs w:val="false"/>
+                <w:sz w:val="14"/>
+                <w:szCs w:val="14"/>
+              </w:rPr>
+              <w:t xml:space="preserve">45, 2,000 (50, 500)</w:t>
+            </w:r>
+          </w:p>
+        </w:tc>
+        <w:tc>
+          <w:tcPr>
+            <w:tcW w:type="dxa" w:w="720"/>
+            <w:tcMar>
+              <w:top w:type="dxa" w:w="50"/>
+              <w:left w:type="dxa" w:w="70"/>
+              <w:bottom w:type="dxa" w:w="50"/>
+              <w:right w:type="dxa" w:w="70"/>
+            </w:tcMar>
+          </w:tcPr>
+          <w:p>
+            <w:pPr>
+              <w:jc w:val="right"/>
+            </w:pPr>
+            <w:r>
+              <w:rPr>
+                <w:rFonts w:ascii="Calibri" w:cs="Calibri" w:eastAsia="Calibri" w:hAnsi="Calibri"/>
+                <w:b w:val="false"/>
+                <w:bCs w:val="false"/>
+                <w:sz w:val="14"/>
+                <w:szCs w:val="14"/>
+              </w:rPr>
+              <w:t xml:space="preserve">$849,915</w:t>
+            </w:r>
+          </w:p>
+        </w:tc>
+        <w:tc>
+          <w:tcPr>
+            <w:tcW w:type="dxa" w:w="760"/>
+            <w:tcMar>
+              <w:top w:type="dxa" w:w="50"/>
+              <w:left w:type="dxa" w:w="70"/>
+              <w:bottom w:type="dxa" w:w="50"/>
+              <w:right w:type="dxa" w:w="70"/>
+            </w:tcMar>
+          </w:tcPr>
+          <w:p>
+            <w:pPr>
+              <w:jc w:val="right"/>
+            </w:pPr>
+            <w:r>
+              <w:rPr>
+                <w:rFonts w:ascii="Calibri" w:cs="Calibri" w:eastAsia="Calibri" w:hAnsi="Calibri"/>
+                <w:b w:val="false"/>
+                <w:bCs w:val="false"/>
+                <w:sz w:val="14"/>
+                <w:szCs w:val="14"/>
+              </w:rPr>
+              <w:t xml:space="preserve">$260,739</w:t>
+            </w:r>
+          </w:p>
+        </w:tc>
+        <w:tc>
+          <w:tcPr>
+            <w:tcW w:type="dxa" w:w="720"/>
+            <w:tcMar>
+              <w:top w:type="dxa" w:w="50"/>
+              <w:left w:type="dxa" w:w="70"/>
+              <w:bottom w:type="dxa" w:w="50"/>
+              <w:right w:type="dxa" w:w="70"/>
+            </w:tcMar>
+          </w:tcPr>
+          <w:p>
+            <w:pPr>
+              <w:jc w:val="right"/>
+            </w:pPr>
+            <w:r>
+              <w:rPr>
+                <w:rFonts w:ascii="Calibri" w:cs="Calibri" w:eastAsia="Calibri" w:hAnsi="Calibri"/>
+                <w:b w:val="false"/>
+                <w:bCs w:val="false"/>
+                <w:sz w:val="14"/>
+                <w:szCs w:val="14"/>
+              </w:rPr>
+              <w:t xml:space="preserve">$312,475</w:t>
+            </w:r>
+          </w:p>
+        </w:tc>
+        <w:tc>
+          <w:tcPr>
+            <w:tcW w:type="dxa" w:w="760"/>
+            <w:tcMar>
+              <w:top w:type="dxa" w:w="50"/>
+              <w:left w:type="dxa" w:w="70"/>
+              <w:bottom w:type="dxa" w:w="50"/>
+              <w:right w:type="dxa" w:w="70"/>
+            </w:tcMar>
+          </w:tcPr>
+          <w:p>
+            <w:pPr>
+              <w:jc w:val="right"/>
+            </w:pPr>
+            <w:r>
+              <w:rPr>
+                <w:rFonts w:ascii="Calibri" w:cs="Calibri" w:eastAsia="Calibri" w:hAnsi="Calibri"/>
+                <w:b w:val="false"/>
+                <w:bCs w:val="false"/>
+                <w:sz w:val="14"/>
+                <w:szCs w:val="14"/>
+              </w:rPr>
+              <w:t xml:space="preserve">$1,423,129</w:t>
+            </w:r>
+          </w:p>
+        </w:tc>
+        <w:tc>
+          <w:tcPr>
+            <w:tcW w:type="dxa" w:w="700"/>
+            <w:tcMar>
+              <w:top w:type="dxa" w:w="50"/>
+              <w:left w:type="dxa" w:w="70"/>
+              <w:bottom w:type="dxa" w:w="50"/>
+              <w:right w:type="dxa" w:w="70"/>
+            </w:tcMar>
+          </w:tcPr>
+          <w:p>
+            <w:pPr>
+              <w:jc w:val="right"/>
+            </w:pPr>
+            <w:r>
+              <w:rPr>
+                <w:rFonts w:ascii="Calibri" w:cs="Calibri" w:eastAsia="Calibri" w:hAnsi="Calibri"/>
+                <w:b w:val="false"/>
+                <w:bCs w:val="false"/>
+                <w:sz w:val="14"/>
+                <w:szCs w:val="14"/>
+              </w:rPr>
+              <w:t xml:space="preserve">($213,469)</w:t>
+            </w:r>
+          </w:p>
+        </w:tc>
+        <w:tc>
+          <w:tcPr>
+            <w:tcW w:type="dxa" w:w="660"/>
+            <w:tcMar>
+              <w:top w:type="dxa" w:w="50"/>
+              <w:left w:type="dxa" w:w="70"/>
+              <w:bottom w:type="dxa" w:w="50"/>
+              <w:right w:type="dxa" w:w="70"/>
+            </w:tcMar>
+          </w:tcPr>
+          <w:p>
+            <w:pPr>
+              <w:jc w:val="right"/>
+            </w:pPr>
+            <w:r>
+              <w:rPr>
+                <w:rFonts w:ascii="Calibri" w:cs="Calibri" w:eastAsia="Calibri" w:hAnsi="Calibri"/>
+                <w:b w:val="false"/>
+                <w:bCs w:val="false"/>
+                <w:sz w:val="14"/>
+                <w:szCs w:val="14"/>
+              </w:rPr>
+              <w:t xml:space="preserve">($11,107)</w:t>
+            </w:r>
+          </w:p>
+        </w:tc>
+        <w:tc>
+          <w:tcPr>
+            <w:tcW w:type="dxa" w:w="620"/>
+            <w:tcMar>
+              <w:top w:type="dxa" w:w="50"/>
+              <w:left w:type="dxa" w:w="70"/>
+              <w:bottom w:type="dxa" w:w="50"/>
+              <w:right w:type="dxa" w:w="70"/>
+            </w:tcMar>
+          </w:tcPr>
+          <w:p>
+            <w:pPr>
+              <w:jc w:val="right"/>
+            </w:pPr>
+            <w:r>
+              <w:rPr>
+                <w:rFonts w:ascii="Calibri" w:cs="Calibri" w:eastAsia="Calibri" w:hAnsi="Calibri"/>
+                <w:b w:val="false"/>
+                <w:bCs w:val="false"/>
+                <w:sz w:val="14"/>
+                <w:szCs w:val="14"/>
+              </w:rPr>
+              <w:t xml:space="preserve">($44,426)</w:t>
+            </w:r>
+          </w:p>
+        </w:tc>
+        <w:tc>
+          <w:tcPr>
+            <w:tcW w:type="dxa" w:w="700"/>
+            <w:tcMar>
+              <w:top w:type="dxa" w:w="50"/>
+              <w:left w:type="dxa" w:w="70"/>
+              <w:bottom w:type="dxa" w:w="50"/>
+              <w:right w:type="dxa" w:w="70"/>
+            </w:tcMar>
+          </w:tcPr>
+          <w:p>
+            <w:pPr>
+              <w:jc w:val="right"/>
+            </w:pPr>
+            <w:r>
+              <w:rPr>
+                <w:rFonts w:ascii="Calibri" w:cs="Calibri" w:eastAsia="Calibri" w:hAnsi="Calibri"/>
+                <w:b w:val="false"/>
+                <w:bCs w:val="false"/>
+                <w:sz w:val="14"/>
+                <w:szCs w:val="14"/>
+              </w:rPr>
+              <w:t xml:space="preserve">($13,945)</w:t>
+            </w:r>
+          </w:p>
+        </w:tc>
+        <w:tc>
+          <w:tcPr>
+            <w:tcW w:type="dxa" w:w="700"/>
+            <w:tcMar>
+              <w:top w:type="dxa" w:w="50"/>
+              <w:left w:type="dxa" w:w="70"/>
+              <w:bottom w:type="dxa" w:w="50"/>
+              <w:right w:type="dxa" w:w="70"/>
+            </w:tcMar>
+          </w:tcPr>
+          <w:p>
+            <w:pPr>
+              <w:jc w:val="right"/>
+            </w:pPr>
+            <w:r>
+              <w:rPr>
+                <w:rFonts w:ascii="Calibri" w:cs="Calibri" w:eastAsia="Calibri" w:hAnsi="Calibri"/>
+                <w:b w:val="false"/>
+                <w:bCs w:val="false"/>
+                <w:sz w:val="14"/>
+                <w:szCs w:val="14"/>
+              </w:rPr>
+              <w:t xml:space="preserve">($102,000)</w:t>
+            </w:r>
+          </w:p>
+        </w:tc>
+        <w:tc>
+          <w:tcPr>
+            <w:tcW w:type="dxa" w:w="700"/>
+            <w:tcMar>
+              <w:top w:type="dxa" w:w="50"/>
+              <w:left w:type="dxa" w:w="70"/>
+              <w:bottom w:type="dxa" w:w="50"/>
+              <w:right w:type="dxa" w:w="70"/>
+            </w:tcMar>
+          </w:tcPr>
+          <w:p>
+            <w:pPr>
+              <w:jc w:val="right"/>
+            </w:pPr>
+            <w:r>
+              <w:rPr>
+                <w:rFonts w:ascii="Calibri" w:cs="Calibri" w:eastAsia="Calibri" w:hAnsi="Calibri"/>
+                <w:b w:val="false"/>
+                <w:bCs w:val="false"/>
+                <w:sz w:val="14"/>
+                <w:szCs w:val="14"/>
+              </w:rPr>
+              <w:t xml:space="preserve">($81,700)</w:t>
+            </w:r>
+          </w:p>
+        </w:tc>
+        <w:tc>
+          <w:tcPr>
+            <w:tcW w:type="dxa" w:w="720"/>
+            <w:tcMar>
+              <w:top w:type="dxa" w:w="50"/>
+              <w:left w:type="dxa" w:w="70"/>
+              <w:bottom w:type="dxa" w:w="50"/>
+              <w:right w:type="dxa" w:w="70"/>
+            </w:tcMar>
+          </w:tcPr>
+          <w:p>
+            <w:pPr>
+              <w:jc w:val="right"/>
+            </w:pPr>
+            <w:r>
+              <w:rPr>
+                <w:rFonts w:ascii="Calibri" w:cs="Calibri" w:eastAsia="Calibri" w:hAnsi="Calibri"/>
+                <w:b w:val="false"/>
+                <w:bCs w:val="false"/>
+                <w:sz w:val="14"/>
+                <w:szCs w:val="14"/>
+              </w:rPr>
+              <w:t xml:space="preserve">$956,482</w:t>
+            </w:r>
+          </w:p>
+        </w:tc>
+        <w:tc>
+          <w:tcPr>
+            <w:tcW w:type="dxa" w:w="800"/>
+            <w:tcMar>
+              <w:top w:type="dxa" w:w="50"/>
+              <w:left w:type="dxa" w:w="70"/>
+              <w:bottom w:type="dxa" w:w="50"/>
+              <w:right w:type="dxa" w:w="70"/>
+            </w:tcMar>
+          </w:tcPr>
+          <w:p>
+            <w:pPr>
+              <w:jc w:val="right"/>
+            </w:pPr>
+            <w:r>
+              <w:rPr>
+                <w:rFonts w:ascii="Calibri" w:cs="Calibri" w:eastAsia="Calibri" w:hAnsi="Calibri"/>
+                <w:b w:val="false"/>
+                <w:bCs w:val="false"/>
+                <w:sz w:val="14"/>
+                <w:szCs w:val="14"/>
+              </w:rPr>
+              <w:t xml:space="preserve">$1,576,770</w:t>
+            </w:r>
+          </w:p>
+        </w:tc>
+      </w:tr>
+      <w:tr>
+        <w:tc>
+          <w:tcPr>
+            <w:tcW w:type="dxa" w:w="520"/>
+            <w:tcMar>
+              <w:top w:type="dxa" w:w="50"/>
+              <w:left w:type="dxa" w:w="70"/>
+              <w:bottom w:type="dxa" w:w="50"/>
+              <w:right w:type="dxa" w:w="70"/>
+            </w:tcMar>
+          </w:tcPr>
+          <w:p>
+            <w:pPr>
+              <w:jc w:val="left"/>
+            </w:pPr>
+            <w:r>
+              <w:rPr>
+                <w:rFonts w:ascii="Calibri" w:cs="Calibri" w:eastAsia="Calibri" w:hAnsi="Calibri"/>
+                <w:b w:val="false"/>
+                <w:bCs w:val="false"/>
+                <w:sz w:val="14"/>
+                <w:szCs w:val="14"/>
+              </w:rPr>
+              <w:t xml:space="preserve">4</w:t>
+            </w:r>
+          </w:p>
+        </w:tc>
+        <w:tc>
+          <w:tcPr>
+            <w:tcW w:type="dxa" w:w="560"/>
+            <w:tcMar>
+              <w:top w:type="dxa" w:w="50"/>
+              <w:left w:type="dxa" w:w="70"/>
+              <w:bottom w:type="dxa" w:w="50"/>
+              <w:right w:type="dxa" w:w="70"/>
+            </w:tcMar>
+          </w:tcPr>
+          <w:p>
+            <w:pPr>
+              <w:jc w:val="right"/>
+            </w:pPr>
+            <w:r>
+              <w:rPr>
+                <w:rFonts w:ascii="Calibri" w:cs="Calibri" w:eastAsia="Calibri" w:hAnsi="Calibri"/>
+                <w:b w:val="false"/>
+                <w:bCs w:val="false"/>
+                <w:sz w:val="14"/>
+                <w:szCs w:val="14"/>
+              </w:rPr>
+              <w:t xml:space="preserve">11,500</w:t>
+            </w:r>
+          </w:p>
+        </w:tc>
+        <w:tc>
+          <w:tcPr>
+            <w:tcW w:type="dxa" w:w="560"/>
+            <w:tcMar>
+              <w:top w:type="dxa" w:w="50"/>
+              <w:left w:type="dxa" w:w="70"/>
+              <w:bottom w:type="dxa" w:w="50"/>
+              <w:right w:type="dxa" w:w="70"/>
+            </w:tcMar>
+          </w:tcPr>
+          <w:p>
+            <w:pPr>
+              <w:jc w:val="right"/>
+            </w:pPr>
+            <w:r>
+              <w:rPr>
+                <w:rFonts w:ascii="Calibri" w:cs="Calibri" w:eastAsia="Calibri" w:hAnsi="Calibri"/>
+                <w:b w:val="false"/>
+                <w:bCs w:val="false"/>
+                <w:sz w:val="14"/>
+                <w:szCs w:val="14"/>
+              </w:rPr>
+              <w:t xml:space="preserve">4,600</w:t>
+            </w:r>
+          </w:p>
+        </w:tc>
+        <w:tc>
+          <w:tcPr>
+            <w:tcW w:type="dxa" w:w="560"/>
+            <w:tcMar>
+              <w:top w:type="dxa" w:w="50"/>
+              <w:left w:type="dxa" w:w="70"/>
+              <w:bottom w:type="dxa" w:w="50"/>
+              <w:right w:type="dxa" w:w="70"/>
+            </w:tcMar>
+          </w:tcPr>
+          <w:p>
+            <w:pPr>
+              <w:jc w:val="right"/>
+            </w:pPr>
+            <w:r>
+              <w:rPr>
+                <w:rFonts w:ascii="Calibri" w:cs="Calibri" w:eastAsia="Calibri" w:hAnsi="Calibri"/>
+                <w:b w:val="false"/>
+                <w:bCs w:val="false"/>
+                <w:sz w:val="14"/>
+                <w:szCs w:val="14"/>
+              </w:rPr>
+              <w:t xml:space="preserve">3,750</w:t>
+            </w:r>
+          </w:p>
+        </w:tc>
+        <w:tc>
+          <w:tcPr>
+            <w:tcW w:type="dxa" w:w="900"/>
+            <w:tcMar>
+              <w:top w:type="dxa" w:w="50"/>
+              <w:left w:type="dxa" w:w="70"/>
+              <w:bottom w:type="dxa" w:w="50"/>
+              <w:right w:type="dxa" w:w="70"/>
+            </w:tcMar>
+          </w:tcPr>
+          <w:p>
+            <w:pPr>
+              <w:jc w:val="right"/>
+            </w:pPr>
+            <w:r>
+              <w:rPr>
+                <w:rFonts w:ascii="Calibri" w:cs="Calibri" w:eastAsia="Calibri" w:hAnsi="Calibri"/>
+                <w:b w:val="false"/>
+                <w:bCs w:val="false"/>
+                <w:sz w:val="14"/>
+                <w:szCs w:val="14"/>
+              </w:rPr>
+              <w:t xml:space="preserve">140, 7,000 (120, 1,200)</w:t>
+            </w:r>
+          </w:p>
+        </w:tc>
+        <w:tc>
+          <w:tcPr>
+            <w:tcW w:type="dxa" w:w="720"/>
+            <w:tcMar>
+              <w:top w:type="dxa" w:w="50"/>
+              <w:left w:type="dxa" w:w="70"/>
+              <w:bottom w:type="dxa" w:w="50"/>
+              <w:right w:type="dxa" w:w="70"/>
+            </w:tcMar>
+          </w:tcPr>
+          <w:p>
+            <w:pPr>
+              <w:jc w:val="right"/>
+            </w:pPr>
+            <w:r>
+              <w:rPr>
+                <w:rFonts w:ascii="Calibri" w:cs="Calibri" w:eastAsia="Calibri" w:hAnsi="Calibri"/>
+                <w:b w:val="false"/>
+                <w:bCs w:val="false"/>
+                <w:sz w:val="14"/>
+                <w:szCs w:val="14"/>
+              </w:rPr>
+              <w:t xml:space="preserve">$1,149,885</w:t>
+            </w:r>
+          </w:p>
+        </w:tc>
+        <w:tc>
+          <w:tcPr>
+            <w:tcW w:type="dxa" w:w="760"/>
+            <w:tcMar>
+              <w:top w:type="dxa" w:w="50"/>
+              <w:left w:type="dxa" w:w="70"/>
+              <w:bottom w:type="dxa" w:w="50"/>
+              <w:right w:type="dxa" w:w="70"/>
+            </w:tcMar>
+          </w:tcPr>
+          <w:p>
+            <w:pPr>
+              <w:jc w:val="right"/>
+            </w:pPr>
+            <w:r>
+              <w:rPr>
+                <w:rFonts w:ascii="Calibri" w:cs="Calibri" w:eastAsia="Calibri" w:hAnsi="Calibri"/>
+                <w:b w:val="false"/>
+                <w:bCs w:val="false"/>
+                <w:sz w:val="14"/>
+                <w:szCs w:val="14"/>
+              </w:rPr>
+              <w:t xml:space="preserve">$449,550</w:t>
+            </w:r>
+          </w:p>
+        </w:tc>
+        <w:tc>
+          <w:tcPr>
+            <w:tcW w:type="dxa" w:w="720"/>
+            <w:tcMar>
+              <w:top w:type="dxa" w:w="50"/>
+              <w:left w:type="dxa" w:w="70"/>
+              <w:bottom w:type="dxa" w:w="50"/>
+              <w:right w:type="dxa" w:w="70"/>
+            </w:tcMar>
+          </w:tcPr>
+          <w:p>
+            <w:pPr>
+              <w:jc w:val="right"/>
+            </w:pPr>
+            <w:r>
+              <w:rPr>
+                <w:rFonts w:ascii="Calibri" w:cs="Calibri" w:eastAsia="Calibri" w:hAnsi="Calibri"/>
+                <w:b w:val="false"/>
+                <w:bCs w:val="false"/>
+                <w:sz w:val="14"/>
+                <w:szCs w:val="14"/>
+              </w:rPr>
+              <w:t xml:space="preserve">$1,024,918</w:t>
+            </w:r>
+          </w:p>
+        </w:tc>
+        <w:tc>
+          <w:tcPr>
+            <w:tcW w:type="dxa" w:w="760"/>
+            <w:tcMar>
+              <w:top w:type="dxa" w:w="50"/>
+              <w:left w:type="dxa" w:w="70"/>
+              <w:bottom w:type="dxa" w:w="50"/>
+              <w:right w:type="dxa" w:w="70"/>
+            </w:tcMar>
+          </w:tcPr>
+          <w:p>
+            <w:pPr>
+              <w:jc w:val="right"/>
+            </w:pPr>
+            <w:r>
+              <w:rPr>
+                <w:rFonts w:ascii="Calibri" w:cs="Calibri" w:eastAsia="Calibri" w:hAnsi="Calibri"/>
+                <w:b w:val="false"/>
+                <w:bCs w:val="false"/>
+                <w:sz w:val="14"/>
+                <w:szCs w:val="14"/>
+              </w:rPr>
+              <w:t xml:space="preserve">$2,624,353</w:t>
+            </w:r>
+          </w:p>
+        </w:tc>
+        <w:tc>
+          <w:tcPr>
+            <w:tcW w:type="dxa" w:w="700"/>
+            <w:tcMar>
+              <w:top w:type="dxa" w:w="50"/>
+              <w:left w:type="dxa" w:w="70"/>
+              <w:bottom w:type="dxa" w:w="50"/>
+              <w:right w:type="dxa" w:w="70"/>
+            </w:tcMar>
+          </w:tcPr>
+          <w:p>
+            <w:pPr>
+              <w:jc w:val="right"/>
+            </w:pPr>
+            <w:r>
+              <w:rPr>
+                <w:rFonts w:ascii="Calibri" w:cs="Calibri" w:eastAsia="Calibri" w:hAnsi="Calibri"/>
+                <w:b w:val="false"/>
+                <w:bCs w:val="false"/>
+                <w:sz w:val="14"/>
+                <w:szCs w:val="14"/>
+              </w:rPr>
+              <w:t xml:space="preserve">($393,653)</w:t>
+            </w:r>
+          </w:p>
+        </w:tc>
+        <w:tc>
+          <w:tcPr>
+            <w:tcW w:type="dxa" w:w="660"/>
+            <w:tcMar>
+              <w:top w:type="dxa" w:w="50"/>
+              <w:left w:type="dxa" w:w="70"/>
+              <w:bottom w:type="dxa" w:w="50"/>
+              <w:right w:type="dxa" w:w="70"/>
+            </w:tcMar>
+          </w:tcPr>
+          <w:p>
+            <w:pPr>
+              <w:jc w:val="right"/>
+            </w:pPr>
+            <w:r>
+              <w:rPr>
+                <w:rFonts w:ascii="Calibri" w:cs="Calibri" w:eastAsia="Calibri" w:hAnsi="Calibri"/>
+                <w:b w:val="false"/>
+                <w:bCs w:val="false"/>
+                <w:sz w:val="14"/>
+                <w:szCs w:val="14"/>
+              </w:rPr>
+              <w:t xml:space="preserve">($15,994)</w:t>
+            </w:r>
+          </w:p>
+        </w:tc>
+        <w:tc>
+          <w:tcPr>
+            <w:tcW w:type="dxa" w:w="620"/>
+            <w:tcMar>
+              <w:top w:type="dxa" w:w="50"/>
+              <w:left w:type="dxa" w:w="70"/>
+              <w:bottom w:type="dxa" w:w="50"/>
+              <w:right w:type="dxa" w:w="70"/>
+            </w:tcMar>
+          </w:tcPr>
+          <w:p>
+            <w:pPr>
+              <w:jc w:val="right"/>
+            </w:pPr>
+            <w:r>
+              <w:rPr>
+                <w:rFonts w:ascii="Calibri" w:cs="Calibri" w:eastAsia="Calibri" w:hAnsi="Calibri"/>
+                <w:b w:val="false"/>
+                <w:bCs w:val="false"/>
+                <w:sz w:val="14"/>
+                <w:szCs w:val="14"/>
+              </w:rPr>
+              <w:t xml:space="preserve">($63,977)</w:t>
+            </w:r>
+          </w:p>
+        </w:tc>
+        <w:tc>
+          <w:tcPr>
+            <w:tcW w:type="dxa" w:w="700"/>
+            <w:tcMar>
+              <w:top w:type="dxa" w:w="50"/>
+              <w:left w:type="dxa" w:w="70"/>
+              <w:bottom w:type="dxa" w:w="50"/>
+              <w:right w:type="dxa" w:w="70"/>
+            </w:tcMar>
+          </w:tcPr>
+          <w:p>
+            <w:pPr>
+              <w:jc w:val="right"/>
+            </w:pPr>
+            <w:r>
+              <w:rPr>
+                <w:rFonts w:ascii="Calibri" w:cs="Calibri" w:eastAsia="Calibri" w:hAnsi="Calibri"/>
+                <w:b w:val="false"/>
+                <w:bCs w:val="false"/>
+                <w:sz w:val="14"/>
+                <w:szCs w:val="14"/>
+              </w:rPr>
+              <w:t xml:space="preserve">($23,619)</w:t>
+            </w:r>
+          </w:p>
+        </w:tc>
+        <w:tc>
+          <w:tcPr>
+            <w:tcW w:type="dxa" w:w="700"/>
+            <w:tcMar>
+              <w:top w:type="dxa" w:w="50"/>
+              <w:left w:type="dxa" w:w="70"/>
+              <w:bottom w:type="dxa" w:w="50"/>
+              <w:right w:type="dxa" w:w="70"/>
+            </w:tcMar>
+          </w:tcPr>
+          <w:p>
+            <w:pPr>
+              <w:jc w:val="right"/>
+            </w:pPr>
+            <w:r>
+              <w:rPr>
+                <w:rFonts w:ascii="Calibri" w:cs="Calibri" w:eastAsia="Calibri" w:hAnsi="Calibri"/>
+                <w:b w:val="false"/>
+                <w:bCs w:val="false"/>
+                <w:sz w:val="14"/>
+                <w:szCs w:val="14"/>
+              </w:rPr>
+              <w:t xml:space="preserve">($138,000)</w:t>
+            </w:r>
+          </w:p>
+        </w:tc>
+        <w:tc>
+          <w:tcPr>
+            <w:tcW w:type="dxa" w:w="700"/>
+            <w:tcMar>
+              <w:top w:type="dxa" w:w="50"/>
+              <w:left w:type="dxa" w:w="70"/>
+              <w:bottom w:type="dxa" w:w="50"/>
+              <w:right w:type="dxa" w:w="70"/>
+            </w:tcMar>
+          </w:tcPr>
+          <w:p>
+            <w:pPr>
+              <w:jc w:val="right"/>
+            </w:pPr>
+            <w:r>
+              <w:rPr>
+                <w:rFonts w:ascii="Calibri" w:cs="Calibri" w:eastAsia="Calibri" w:hAnsi="Calibri"/>
+                <w:b w:val="false"/>
+                <w:bCs w:val="false"/>
+                <w:sz w:val="14"/>
+                <w:szCs w:val="14"/>
+              </w:rPr>
+              <w:t xml:space="preserve">($114,700)</w:t>
+            </w:r>
+          </w:p>
+        </w:tc>
+        <w:tc>
+          <w:tcPr>
+            <w:tcW w:type="dxa" w:w="720"/>
+            <w:tcMar>
+              <w:top w:type="dxa" w:w="50"/>
+              <w:left w:type="dxa" w:w="70"/>
+              <w:bottom w:type="dxa" w:w="50"/>
+              <w:right w:type="dxa" w:w="70"/>
+            </w:tcMar>
+          </w:tcPr>
+          <w:p>
+            <w:pPr>
+              <w:jc w:val="right"/>
+            </w:pPr>
+            <w:r>
+              <w:rPr>
+                <w:rFonts w:ascii="Calibri" w:cs="Calibri" w:eastAsia="Calibri" w:hAnsi="Calibri"/>
+                <w:b w:val="false"/>
+                <w:bCs w:val="false"/>
+                <w:sz w:val="14"/>
+                <w:szCs w:val="14"/>
+              </w:rPr>
+              <w:t xml:space="preserve">$1,874,409</w:t>
+            </w:r>
+          </w:p>
+        </w:tc>
+        <w:tc>
+          <w:tcPr>
+            <w:tcW w:type="dxa" w:w="800"/>
+            <w:tcMar>
+              <w:top w:type="dxa" w:w="50"/>
+              <w:left w:type="dxa" w:w="70"/>
+              <w:bottom w:type="dxa" w:w="50"/>
+              <w:right w:type="dxa" w:w="70"/>
+            </w:tcMar>
+          </w:tcPr>
+          <w:p>
+            <w:pPr>
+              <w:jc w:val="right"/>
+            </w:pPr>
+            <w:r>
+              <w:rPr>
+                <w:rFonts w:ascii="Calibri" w:cs="Calibri" w:eastAsia="Calibri" w:hAnsi="Calibri"/>
+                <w:b w:val="false"/>
+                <w:bCs w:val="false"/>
+                <w:sz w:val="14"/>
+                <w:szCs w:val="14"/>
+              </w:rPr>
+              <w:t xml:space="preserve">$3,451,179</w:t>
+            </w:r>
+          </w:p>
+        </w:tc>
+      </w:tr>
+      <w:tr>
+        <w:tc>
+          <w:tcPr>
+            <w:tcW w:type="dxa" w:w="520"/>
+            <w:tcMar>
+              <w:top w:type="dxa" w:w="50"/>
+              <w:left w:type="dxa" w:w="70"/>
+              <w:bottom w:type="dxa" w:w="50"/>
+              <w:right w:type="dxa" w:w="70"/>
+            </w:tcMar>
+          </w:tcPr>
+          <w:p>
+            <w:pPr>
+              <w:jc w:val="left"/>
+            </w:pPr>
+            <w:r>
+              <w:rPr>
+                <w:rFonts w:ascii="Calibri" w:cs="Calibri" w:eastAsia="Calibri" w:hAnsi="Calibri"/>
+                <w:b w:val="false"/>
+                <w:bCs w:val="false"/>
+                <w:sz w:val="14"/>
+                <w:szCs w:val="14"/>
+              </w:rPr>
+              <w:t xml:space="preserve">5</w:t>
+            </w:r>
+          </w:p>
+        </w:tc>
+        <w:tc>
+          <w:tcPr>
+            <w:tcW w:type="dxa" w:w="560"/>
+            <w:tcMar>
+              <w:top w:type="dxa" w:w="50"/>
+              <w:left w:type="dxa" w:w="70"/>
+              <w:bottom w:type="dxa" w:w="50"/>
+              <w:right w:type="dxa" w:w="70"/>
+            </w:tcMar>
+          </w:tcPr>
+          <w:p>
+            <w:pPr>
+              <w:jc w:val="right"/>
+            </w:pPr>
+            <w:r>
+              <w:rPr>
+                <w:rFonts w:ascii="Calibri" w:cs="Calibri" w:eastAsia="Calibri" w:hAnsi="Calibri"/>
+                <w:b w:val="false"/>
+                <w:bCs w:val="false"/>
+                <w:sz w:val="14"/>
+                <w:szCs w:val="14"/>
+              </w:rPr>
+              <w:t xml:space="preserve">14,500</w:t>
+            </w:r>
+          </w:p>
+        </w:tc>
+        <w:tc>
+          <w:tcPr>
+            <w:tcW w:type="dxa" w:w="560"/>
+            <w:tcMar>
+              <w:top w:type="dxa" w:w="50"/>
+              <w:left w:type="dxa" w:w="70"/>
+              <w:bottom w:type="dxa" w:w="50"/>
+              <w:right w:type="dxa" w:w="70"/>
+            </w:tcMar>
+          </w:tcPr>
+          <w:p>
+            <w:pPr>
+              <w:jc w:val="right"/>
+            </w:pPr>
+            <w:r>
+              <w:rPr>
+                <w:rFonts w:ascii="Calibri" w:cs="Calibri" w:eastAsia="Calibri" w:hAnsi="Calibri"/>
+                <w:b w:val="false"/>
+                <w:bCs w:val="false"/>
+                <w:sz w:val="14"/>
+                <w:szCs w:val="14"/>
+              </w:rPr>
+              <w:t xml:space="preserve">6,500</w:t>
+            </w:r>
+          </w:p>
+        </w:tc>
+        <w:tc>
+          <w:tcPr>
+            <w:tcW w:type="dxa" w:w="560"/>
+            <w:tcMar>
+              <w:top w:type="dxa" w:w="50"/>
+              <w:left w:type="dxa" w:w="70"/>
+              <w:bottom w:type="dxa" w:w="50"/>
+              <w:right w:type="dxa" w:w="70"/>
+            </w:tcMar>
+          </w:tcPr>
+          <w:p>
+            <w:pPr>
+              <w:jc w:val="right"/>
+            </w:pPr>
+            <w:r>
+              <w:rPr>
+                <w:rFonts w:ascii="Calibri" w:cs="Calibri" w:eastAsia="Calibri" w:hAnsi="Calibri"/>
+                <w:b w:val="false"/>
+                <w:bCs w:val="false"/>
+                <w:sz w:val="14"/>
+                <w:szCs w:val="14"/>
+              </w:rPr>
+              <w:t xml:space="preserve">5,550</w:t>
+            </w:r>
+          </w:p>
+        </w:tc>
+        <w:tc>
+          <w:tcPr>
+            <w:tcW w:type="dxa" w:w="900"/>
+            <w:tcMar>
+              <w:top w:type="dxa" w:w="50"/>
+              <w:left w:type="dxa" w:w="70"/>
+              <w:bottom w:type="dxa" w:w="50"/>
+              <w:right w:type="dxa" w:w="70"/>
+            </w:tcMar>
+          </w:tcPr>
+          <w:p>
+            <w:pPr>
+              <w:jc w:val="right"/>
+            </w:pPr>
+            <w:r>
+              <w:rPr>
+                <w:rFonts w:ascii="Calibri" w:cs="Calibri" w:eastAsia="Calibri" w:hAnsi="Calibri"/>
+                <w:b w:val="false"/>
+                <w:bCs w:val="false"/>
+                <w:sz w:val="14"/>
+                <w:szCs w:val="14"/>
+              </w:rPr>
+              <w:t xml:space="preserve">320, 17,500 (250, 2,500)</w:t>
+            </w:r>
+          </w:p>
+        </w:tc>
+        <w:tc>
+          <w:tcPr>
+            <w:tcW w:type="dxa" w:w="720"/>
+            <w:tcMar>
+              <w:top w:type="dxa" w:w="50"/>
+              <w:left w:type="dxa" w:w="70"/>
+              <w:bottom w:type="dxa" w:w="50"/>
+              <w:right w:type="dxa" w:w="70"/>
+            </w:tcMar>
+          </w:tcPr>
+          <w:p>
+            <w:pPr>
+              <w:jc w:val="right"/>
+            </w:pPr>
+            <w:r>
+              <w:rPr>
+                <w:rFonts w:ascii="Calibri" w:cs="Calibri" w:eastAsia="Calibri" w:hAnsi="Calibri"/>
+                <w:b w:val="false"/>
+                <w:bCs w:val="false"/>
+                <w:sz w:val="14"/>
+                <w:szCs w:val="14"/>
+              </w:rPr>
+              <w:t xml:space="preserve">$1,449,855</w:t>
+            </w:r>
+          </w:p>
+        </w:tc>
+        <w:tc>
+          <w:tcPr>
+            <w:tcW w:type="dxa" w:w="760"/>
+            <w:tcMar>
+              <w:top w:type="dxa" w:w="50"/>
+              <w:left w:type="dxa" w:w="70"/>
+              <w:bottom w:type="dxa" w:w="50"/>
+              <w:right w:type="dxa" w:w="70"/>
+            </w:tcMar>
+          </w:tcPr>
+          <w:p>
+            <w:pPr>
+              <w:jc w:val="right"/>
+            </w:pPr>
+            <w:r>
+              <w:rPr>
+                <w:rFonts w:ascii="Calibri" w:cs="Calibri" w:eastAsia="Calibri" w:hAnsi="Calibri"/>
+                <w:b w:val="false"/>
+                <w:bCs w:val="false"/>
+                <w:sz w:val="14"/>
+                <w:szCs w:val="14"/>
+              </w:rPr>
+              <w:t xml:space="preserve">$665,334</w:t>
+            </w:r>
+          </w:p>
+        </w:tc>
+        <w:tc>
+          <w:tcPr>
+            <w:tcW w:type="dxa" w:w="720"/>
+            <w:tcMar>
+              <w:top w:type="dxa" w:w="50"/>
+              <w:left w:type="dxa" w:w="70"/>
+              <w:bottom w:type="dxa" w:w="50"/>
+              <w:right w:type="dxa" w:w="70"/>
+            </w:tcMar>
+          </w:tcPr>
+          <w:p>
+            <w:pPr>
+              <w:jc w:val="right"/>
+            </w:pPr>
+            <w:r>
+              <w:rPr>
+                <w:rFonts w:ascii="Calibri" w:cs="Calibri" w:eastAsia="Calibri" w:hAnsi="Calibri"/>
+                <w:b w:val="false"/>
+                <w:bCs w:val="false"/>
+                <w:sz w:val="14"/>
+                <w:szCs w:val="14"/>
+              </w:rPr>
+              <w:t xml:space="preserve">$2,499,800</w:t>
+            </w:r>
+          </w:p>
+        </w:tc>
+        <w:tc>
+          <w:tcPr>
+            <w:tcW w:type="dxa" w:w="760"/>
+            <w:tcMar>
+              <w:top w:type="dxa" w:w="50"/>
+              <w:left w:type="dxa" w:w="70"/>
+              <w:bottom w:type="dxa" w:w="50"/>
+              <w:right w:type="dxa" w:w="70"/>
+            </w:tcMar>
+          </w:tcPr>
+          <w:p>
+            <w:pPr>
+              <w:jc w:val="right"/>
+            </w:pPr>
+            <w:r>
+              <w:rPr>
+                <w:rFonts w:ascii="Calibri" w:cs="Calibri" w:eastAsia="Calibri" w:hAnsi="Calibri"/>
+                <w:b w:val="false"/>
+                <w:bCs w:val="false"/>
+                <w:sz w:val="14"/>
+                <w:szCs w:val="14"/>
+              </w:rPr>
+              <w:t xml:space="preserve">$4,614,989</w:t>
+            </w:r>
+          </w:p>
+        </w:tc>
+        <w:tc>
+          <w:tcPr>
+            <w:tcW w:type="dxa" w:w="700"/>
+            <w:tcMar>
+              <w:top w:type="dxa" w:w="50"/>
+              <w:left w:type="dxa" w:w="70"/>
+              <w:bottom w:type="dxa" w:w="50"/>
+              <w:right w:type="dxa" w:w="70"/>
+            </w:tcMar>
+          </w:tcPr>
+          <w:p>
+            <w:pPr>
+              <w:jc w:val="right"/>
+            </w:pPr>
+            <w:r>
+              <w:rPr>
+                <w:rFonts w:ascii="Calibri" w:cs="Calibri" w:eastAsia="Calibri" w:hAnsi="Calibri"/>
+                <w:b w:val="false"/>
+                <w:bCs w:val="false"/>
+                <w:sz w:val="14"/>
+                <w:szCs w:val="14"/>
+              </w:rPr>
+              <w:t xml:space="preserve">($692,248)</w:t>
+            </w:r>
+          </w:p>
+        </w:tc>
+        <w:tc>
+          <w:tcPr>
+            <w:tcW w:type="dxa" w:w="660"/>
+            <w:tcMar>
+              <w:top w:type="dxa" w:w="50"/>
+              <w:left w:type="dxa" w:w="70"/>
+              <w:bottom w:type="dxa" w:w="50"/>
+              <w:right w:type="dxa" w:w="70"/>
+            </w:tcMar>
+          </w:tcPr>
+          <w:p>
+            <w:pPr>
+              <w:jc w:val="right"/>
+            </w:pPr>
+            <w:r>
+              <w:rPr>
+                <w:rFonts w:ascii="Calibri" w:cs="Calibri" w:eastAsia="Calibri" w:hAnsi="Calibri"/>
+                <w:b w:val="false"/>
+                <w:bCs w:val="false"/>
+                <w:sz w:val="14"/>
+                <w:szCs w:val="14"/>
+              </w:rPr>
+              <w:t xml:space="preserve">($21,152)</w:t>
+            </w:r>
+          </w:p>
+        </w:tc>
+        <w:tc>
+          <w:tcPr>
+            <w:tcW w:type="dxa" w:w="620"/>
+            <w:tcMar>
+              <w:top w:type="dxa" w:w="50"/>
+              <w:left w:type="dxa" w:w="70"/>
+              <w:bottom w:type="dxa" w:w="50"/>
+              <w:right w:type="dxa" w:w="70"/>
+            </w:tcMar>
+          </w:tcPr>
+          <w:p>
+            <w:pPr>
+              <w:jc w:val="right"/>
+            </w:pPr>
+            <w:r>
+              <w:rPr>
+                <w:rFonts w:ascii="Calibri" w:cs="Calibri" w:eastAsia="Calibri" w:hAnsi="Calibri"/>
+                <w:b w:val="false"/>
+                <w:bCs w:val="false"/>
+                <w:sz w:val="14"/>
+                <w:szCs w:val="14"/>
+              </w:rPr>
+              <w:t xml:space="preserve">($84,608)</w:t>
+            </w:r>
+          </w:p>
+        </w:tc>
+        <w:tc>
+          <w:tcPr>
+            <w:tcW w:type="dxa" w:w="700"/>
+            <w:tcMar>
+              <w:top w:type="dxa" w:w="50"/>
+              <w:left w:type="dxa" w:w="70"/>
+              <w:bottom w:type="dxa" w:w="50"/>
+              <w:right w:type="dxa" w:w="70"/>
+            </w:tcMar>
+          </w:tcPr>
+          <w:p>
+            <w:pPr>
+              <w:jc w:val="right"/>
+            </w:pPr>
+            <w:r>
+              <w:rPr>
+                <w:rFonts w:ascii="Calibri" w:cs="Calibri" w:eastAsia="Calibri" w:hAnsi="Calibri"/>
+                <w:b w:val="false"/>
+                <w:bCs w:val="false"/>
+                <w:sz w:val="14"/>
+                <w:szCs w:val="14"/>
+              </w:rPr>
+              <w:t xml:space="preserve">($34,653)</w:t>
+            </w:r>
+          </w:p>
+        </w:tc>
+        <w:tc>
+          <w:tcPr>
+            <w:tcW w:type="dxa" w:w="700"/>
+            <w:tcMar>
+              <w:top w:type="dxa" w:w="50"/>
+              <w:left w:type="dxa" w:w="70"/>
+              <w:bottom w:type="dxa" w:w="50"/>
+              <w:right w:type="dxa" w:w="70"/>
+            </w:tcMar>
+          </w:tcPr>
+          <w:p>
+            <w:pPr>
+              <w:jc w:val="right"/>
+            </w:pPr>
+            <w:r>
+              <w:rPr>
+                <w:rFonts w:ascii="Calibri" w:cs="Calibri" w:eastAsia="Calibri" w:hAnsi="Calibri"/>
+                <w:b w:val="false"/>
+                <w:bCs w:val="false"/>
+                <w:sz w:val="14"/>
+                <w:szCs w:val="14"/>
+              </w:rPr>
+              <w:t xml:space="preserve">($174,000)</w:t>
+            </w:r>
+          </w:p>
+        </w:tc>
+        <w:tc>
+          <w:tcPr>
+            <w:tcW w:type="dxa" w:w="700"/>
+            <w:tcMar>
+              <w:top w:type="dxa" w:w="50"/>
+              <w:left w:type="dxa" w:w="70"/>
+              <w:bottom w:type="dxa" w:w="50"/>
+              <w:right w:type="dxa" w:w="70"/>
+            </w:tcMar>
+          </w:tcPr>
+          <w:p>
+            <w:pPr>
+              <w:jc w:val="right"/>
+            </w:pPr>
+            <w:r>
+              <w:rPr>
+                <w:rFonts w:ascii="Calibri" w:cs="Calibri" w:eastAsia="Calibri" w:hAnsi="Calibri"/>
+                <w:b w:val="false"/>
+                <w:bCs w:val="false"/>
+                <w:sz w:val="14"/>
+                <w:szCs w:val="14"/>
+              </w:rPr>
+              <w:t xml:space="preserve">($147,700)</w:t>
+            </w:r>
+          </w:p>
+        </w:tc>
+        <w:tc>
+          <w:tcPr>
+            <w:tcW w:type="dxa" w:w="720"/>
+            <w:tcMar>
+              <w:top w:type="dxa" w:w="50"/>
+              <w:left w:type="dxa" w:w="70"/>
+              <w:bottom w:type="dxa" w:w="50"/>
+              <w:right w:type="dxa" w:w="70"/>
+            </w:tcMar>
+          </w:tcPr>
+          <w:p>
+            <w:pPr>
+              <w:jc w:val="right"/>
+            </w:pPr>
+            <w:r>
+              <w:rPr>
+                <w:rFonts w:ascii="Calibri" w:cs="Calibri" w:eastAsia="Calibri" w:hAnsi="Calibri"/>
+                <w:b w:val="false"/>
+                <w:bCs w:val="false"/>
+                <w:sz w:val="14"/>
+                <w:szCs w:val="14"/>
+              </w:rPr>
+              <w:t xml:space="preserve">$3,460,628</w:t>
+            </w:r>
+          </w:p>
+        </w:tc>
+        <w:tc>
+          <w:tcPr>
+            <w:tcW w:type="dxa" w:w="800"/>
+            <w:tcMar>
+              <w:top w:type="dxa" w:w="50"/>
+              <w:left w:type="dxa" w:w="70"/>
+              <w:bottom w:type="dxa" w:w="50"/>
+              <w:right w:type="dxa" w:w="70"/>
+            </w:tcMar>
+          </w:tcPr>
+          <w:p>
+            <w:pPr>
+              <w:jc w:val="right"/>
+            </w:pPr>
+            <w:r>
+              <w:rPr>
+                <w:rFonts w:ascii="Calibri" w:cs="Calibri" w:eastAsia="Calibri" w:hAnsi="Calibri"/>
+                <w:b w:val="false"/>
+                <w:bCs w:val="false"/>
+                <w:sz w:val="14"/>
+                <w:szCs w:val="14"/>
+              </w:rPr>
+              <w:t xml:space="preserve">$6,911,808</w:t>
             </w:r>
           </w:p>
         </w:tc>
@@ -10102,7 +12853,176 @@
         <w:rPr>
           <w:rFonts w:ascii="Calibri" w:cs="Calibri" w:eastAsia="Calibri" w:hAnsi="Calibri"/>
         </w:rPr>
-        <w:t xml:space="preserve">5. RevenueCat, and what the server does with each event</w:t>
+        <w:t xml:space="preserve">5. Rollout roadmap, as the Master Hub page lays it out, with what has been checked</w:t>
+      </w:r>
+    </w:p>
+    <w:p>
+      <w:pPr>
+        <w:spacing w:after="120"/>
+      </w:pPr>
+      <w:r>
+        <w:rPr>
+          <w:rFonts w:ascii="Calibri" w:cs="Calibri" w:eastAsia="Calibri" w:hAnsi="Calibri"/>
+          <w:sz w:val="22"/>
+          <w:szCs w:val="22"/>
+        </w:rPr>
+        <w:t xml:space="preserve">The three phases and their month ranges are the pasted page’s; Frank has not set dates. On 8 September the sites for every claim but Apple’s refused a connection from the build environment, so those lines are unverified and say how to reach the source.</w:t>
+      </w:r>
+    </w:p>
+    <w:p>
+      <w:pPr>
+        <w:pStyle w:val="Heading2"/>
+        <w:spacing w:after="100" w:before="240"/>
+      </w:pPr>
+      <w:r>
+        <w:rPr>
+          <w:rFonts w:ascii="Calibri" w:cs="Calibri" w:eastAsia="Calibri" w:hAnsi="Calibri"/>
+        </w:rPr>
+        <w:t xml:space="preserve">Phase 1, a Florida cluster (months 6 to 18 on the page)</w:t>
+      </w:r>
+    </w:p>
+    <w:p>
+      <w:pPr>
+        <w:pStyle w:val="ListParagraph"/>
+        <w:numPr>
+          <w:ilvl w:val="0"/>
+          <w:numId w:val="2"/>
+        </w:numPr>
+        <w:spacing w:after="80"/>
+      </w:pPr>
+      <w:r>
+        <w:rPr>
+          <w:rFonts w:ascii="Calibri" w:cs="Calibri" w:eastAsia="Calibri" w:hAnsi="Calibri"/>
+          <w:sz w:val="22"/>
+          <w:szCs w:val="22"/>
+        </w:rPr>
+        <w:t xml:space="preserve">Anchor pilot at Evan’s school: Year 1 is the free pilot requested by its ESE director (Frank’s 7 September document). The page adds documented classroom data from Cynthia Puentes; no such data exists in the repository or the ledger, so nothing here cites it.</w:t>
+      </w:r>
+    </w:p>
+    <w:p>
+      <w:pPr>
+        <w:pStyle w:val="ListParagraph"/>
+        <w:numPr>
+          <w:ilvl w:val="0"/>
+          <w:numId w:val="2"/>
+        </w:numPr>
+        <w:spacing w:after="80"/>
+      </w:pPr>
+      <w:r>
+        <w:rPr>
+          <w:rFonts w:ascii="Calibri" w:cs="Calibri" w:eastAsia="Calibri" w:hAnsi="Calibri"/>
+          <w:sz w:val="22"/>
+          <w:szCs w:val="22"/>
+        </w:rPr>
+        <w:t xml:space="preserve">FDLRS centers (Florida Diagnostic and Learning Resources System) for Martin, Palm Beach, Brevard, Indian River and Okeechobee counties: unverified. Search "FDLRS associate centers" on fldoe.org, the Florida Department of Education, or open fdlrs.org.</w:t>
+      </w:r>
+    </w:p>
+    <w:p>
+      <w:pPr>
+        <w:pStyle w:val="Heading2"/>
+        <w:spacing w:after="100" w:before="240"/>
+      </w:pPr>
+      <w:r>
+        <w:rPr>
+          <w:rFonts w:ascii="Calibri" w:cs="Calibri" w:eastAsia="Calibri" w:hAnsi="Calibri"/>
+        </w:rPr>
+        <w:t xml:space="preserve">Phase 2, statewide Florida and regional hubs (months 18 to 36 on the page)</w:t>
+      </w:r>
+    </w:p>
+    <w:p>
+      <w:pPr>
+        <w:pStyle w:val="ListParagraph"/>
+        <w:numPr>
+          <w:ilvl w:val="0"/>
+          <w:numId w:val="2"/>
+        </w:numPr>
+        <w:spacing w:after="80"/>
+      </w:pPr>
+      <w:r>
+        <w:rPr>
+          <w:rFonts w:ascii="Calibri" w:cs="Calibri" w:eastAsia="Calibri" w:hAnsi="Calibri"/>
+          <w:sz w:val="22"/>
+          <w:szCs w:val="22"/>
+        </w:rPr>
+        <w:t xml:space="preserve">FAAST lending libraries (Florida Alliance for Assistive Services and Technology), so a school speech-language pathologist can try the app before ordering: unverified, including whether FAAST lends software. Search "FAAST Florida assistive technology device loan program".</w:t>
+      </w:r>
+    </w:p>
+    <w:p>
+      <w:pPr>
+        <w:pStyle w:val="ListParagraph"/>
+        <w:numPr>
+          <w:ilvl w:val="0"/>
+          <w:numId w:val="2"/>
+        </w:numPr>
+        <w:spacing w:after="80"/>
+      </w:pPr>
+      <w:r>
+        <w:rPr>
+          <w:rFonts w:ascii="Calibri" w:cs="Calibri" w:eastAsia="Calibri" w:hAnsi="Calibri"/>
+          <w:sz w:val="22"/>
+          <w:szCs w:val="22"/>
+        </w:rPr>
+        <w:t xml:space="preserve">Orders under the micro-purchase line so an ESE director can sign without a board vote, using IDEA Part B money: the federal threshold is in 2 CFR 200.1; its current figure, and whether a district sets a lower one, are unverified. Search "2 CFR 200.1 micro-purchase threshold" and open the ecfr.gov result. Board rules are the district’s own.</w:t>
+      </w:r>
+    </w:p>
+    <w:p>
+      <w:pPr>
+        <w:pStyle w:val="Heading2"/>
+        <w:spacing w:after="100" w:before="240"/>
+      </w:pPr>
+      <w:r>
+        <w:rPr>
+          <w:rFonts w:ascii="Calibri" w:cs="Calibri" w:eastAsia="Calibri" w:hAnsi="Calibri"/>
+        </w:rPr>
+        <w:t xml:space="preserve">Phase 3, national (months 36 to 60 on the page)</w:t>
+      </w:r>
+    </w:p>
+    <w:p>
+      <w:pPr>
+        <w:pStyle w:val="ListParagraph"/>
+        <w:numPr>
+          <w:ilvl w:val="0"/>
+          <w:numId w:val="2"/>
+        </w:numPr>
+        <w:spacing w:after="80"/>
+      </w:pPr>
+      <w:r>
+        <w:rPr>
+          <w:rFonts w:ascii="Calibri" w:cs="Calibri" w:eastAsia="Calibri" w:hAnsi="Calibri"/>
+          <w:sz w:val="22"/>
+          <w:szCs w:val="22"/>
+        </w:rPr>
+        <w:t xml:space="preserve">Conferences, ATIA in Orlando and the CEC convention: dates, cities and exhibitor costs unverified. Search "ATIA conference exhibitor" and "CEC convention exhibitor".</w:t>
+      </w:r>
+    </w:p>
+    <w:p>
+      <w:pPr>
+        <w:pStyle w:val="ListParagraph"/>
+        <w:numPr>
+          <w:ilvl w:val="0"/>
+          <w:numId w:val="2"/>
+        </w:numPr>
+        <w:spacing w:after="80"/>
+      </w:pPr>
+      <w:r>
+        <w:rPr>
+          <w:rFonts w:ascii="Calibri" w:cs="Calibri" w:eastAsia="Calibri" w:hAnsi="Calibri"/>
+          <w:sz w:val="22"/>
+          <w:szCs w:val="22"/>
+        </w:rPr>
+        <w:t xml:space="preserve">Apple School Manager volume purchase: verified from developer.apple.com/education on 8 September. Every App Store app is automatically available for volume purchase there, and a developer can enable a 50% discount for institutions buying 20 or more copies of the app. The discount is on copies of the app itself, so a school seat priced differently from the consumer app would need its own listing or a custom app; not settled.</w:t>
+      </w:r>
+    </w:p>
+    <w:p>
+      <w:pPr>
+        <w:pStyle w:val="Heading1"/>
+        <w:spacing w:after="120" w:before="320"/>
+      </w:pPr>
+      <w:r>
+        <w:rPr>
+          <w:rFonts w:ascii="Calibri" w:cs="Calibri" w:eastAsia="Calibri" w:hAnsi="Calibri"/>
+        </w:rPr>
+        <w:t xml:space="preserve">6. RevenueCat, and what the server does with each event</w:t>
       </w:r>
     </w:p>
     <w:p>
@@ -10168,7 +13088,7 @@
         <w:rPr>
           <w:rFonts w:ascii="Calibri" w:cs="Calibri" w:eastAsia="Calibri" w:hAnsi="Calibri"/>
         </w:rPr>
-        <w:t xml:space="preserve">6. What is owed</w:t>
+        <w:t xml:space="preserve">7. What is owed</w:t>
       </w:r>
     </w:p>
     <w:p>
@@ -10204,7 +13124,25 @@
           <w:sz w:val="22"/>
           <w:szCs w:val="22"/>
         </w:rPr>
-        <w:t xml:space="preserve">Verification from the companies’ own pages of the items marked "from Frank’s document": 10DLC fees, Vercel’s price, Codemagic’s free tier, and Apple School Manager’s education volume discount.</w:t>
+        <w:t xml:space="preserve">Verification from the companies’ own pages of the items marked "from Frank’s document": 10DLC fees, Vercel’s price, Codemagic’s free tier. Apple’s education volume discount was verified 8 September.</w:t>
+      </w:r>
+    </w:p>
+    <w:p>
+      <w:pPr>
+        <w:pStyle w:val="ListParagraph"/>
+        <w:numPr>
+          <w:ilvl w:val="0"/>
+          <w:numId w:val="3"/>
+        </w:numPr>
+        <w:spacing w:after="100"/>
+      </w:pPr>
+      <w:r>
+        <w:rPr>
+          <w:rFonts w:ascii="Calibri" w:cs="Calibri" w:eastAsia="Calibri" w:hAnsi="Calibri"/>
+          <w:sz w:val="22"/>
+          <w:szCs w:val="22"/>
+        </w:rPr>
+        <w:t xml:space="preserve">Frank’s word on how the Core Talker is sold, a paid app or a free app with a one-time purchase, because it decides what the webhook does with NON_RENEWING_PURCHASE; and on who the clinics in the National case are.</w:t>
       </w:r>
     </w:p>
     <w:p>

</xml_diff>

<commit_message>
Correction: Pro is sold direct by EZ Voice, districts and clinics included; store commission off Pro seats; my wrong attribution recorded; documents regenerated
Co-Authored-By: Claude Fable 5.1 <noreply@anthropic.com>
Claude-Session: https://claude.ai/code/session_01FdLL4Wp3bi12KNX6zHRo7N
</commit_message>
<xml_diff>
--- a/EZvoxa Business Plan and Projections.docx
+++ b/EZvoxa Business Plan and Projections.docx
@@ -1840,7 +1840,7 @@
         <w:rPr>
           <w:rFonts w:ascii="Calibri" w:cs="Calibri" w:eastAsia="Calibri" w:hAnsi="Calibri"/>
         </w:rPr>
-        <w:t xml:space="preserve">Floor case: five-year net $462,467, 6,350 buyers, 620 subscribers at the end of Year 5</w:t>
+        <w:t xml:space="preserve">Floor case: five-year net $475,403, 6,350 buyers, 620 subscribers at the end of Year 5</w:t>
       </w:r>
     </w:p>
     <w:tbl>
@@ -3036,7 +3036,7 @@
                 <w:sz w:val="14"/>
                 <w:szCs w:val="14"/>
               </w:rPr>
-              <w:t xml:space="preserve">($18,731)</w:t>
+              <w:t xml:space="preserve">($17,606)</w:t>
             </w:r>
           </w:p>
         </w:tc>
@@ -3192,7 +3192,7 @@
                 <w:sz w:val="14"/>
                 <w:szCs w:val="14"/>
               </w:rPr>
-              <w:t xml:space="preserve">$60,541</w:t>
+              <w:t xml:space="preserve">$61,666</w:t>
             </w:r>
           </w:p>
         </w:tc>
@@ -3218,7 +3218,7 @@
                 <w:sz w:val="14"/>
                 <w:szCs w:val="14"/>
               </w:rPr>
-              <w:t xml:space="preserve">$72,908</w:t>
+              <w:t xml:space="preserve">$74,033</w:t>
             </w:r>
           </w:p>
         </w:tc>
@@ -3480,7 +3480,7 @@
                 <w:sz w:val="14"/>
                 <w:szCs w:val="14"/>
               </w:rPr>
-              <w:t xml:space="preserve">($28,373)</w:t>
+              <w:t xml:space="preserve">($26,123)</w:t>
             </w:r>
           </w:p>
         </w:tc>
@@ -3636,7 +3636,7 @@
                 <w:sz w:val="14"/>
                 <w:szCs w:val="14"/>
               </w:rPr>
-              <w:t xml:space="preserve">$99,001</w:t>
+              <w:t xml:space="preserve">$101,251</w:t>
             </w:r>
           </w:p>
         </w:tc>
@@ -3662,7 +3662,7 @@
                 <w:sz w:val="14"/>
                 <w:szCs w:val="14"/>
               </w:rPr>
-              <w:t xml:space="preserve">$171,909</w:t>
+              <w:t xml:space="preserve">$175,284</w:t>
             </w:r>
           </w:p>
         </w:tc>
@@ -3924,7 +3924,7 @@
                 <w:sz w:val="14"/>
                 <w:szCs w:val="14"/>
               </w:rPr>
-              <w:t xml:space="preserve">($36,417)</w:t>
+              <w:t xml:space="preserve">($32,480)</w:t>
             </w:r>
           </w:p>
         </w:tc>
@@ -4080,7 +4080,7 @@
                 <w:sz w:val="14"/>
                 <w:szCs w:val="14"/>
               </w:rPr>
-              <w:t xml:space="preserve">$131,498</w:t>
+              <w:t xml:space="preserve">$135,435</w:t>
             </w:r>
           </w:p>
         </w:tc>
@@ -4106,7 +4106,7 @@
                 <w:sz w:val="14"/>
                 <w:szCs w:val="14"/>
               </w:rPr>
-              <w:t xml:space="preserve">$303,407</w:t>
+              <w:t xml:space="preserve">$310,719</w:t>
             </w:r>
           </w:p>
         </w:tc>
@@ -4368,7 +4368,7 @@
                 <w:sz w:val="14"/>
                 <w:szCs w:val="14"/>
               </w:rPr>
-              <w:t xml:space="preserve">($42,692)</w:t>
+              <w:t xml:space="preserve">($37,067)</w:t>
             </w:r>
           </w:p>
         </w:tc>
@@ -4524,7 +4524,7 @@
                 <w:sz w:val="14"/>
                 <w:szCs w:val="14"/>
               </w:rPr>
-              <w:t xml:space="preserve">$159,060</w:t>
+              <w:t xml:space="preserve">$164,684</w:t>
             </w:r>
           </w:p>
         </w:tc>
@@ -4550,7 +4550,7 @@
                 <w:sz w:val="14"/>
                 <w:szCs w:val="14"/>
               </w:rPr>
-              <w:t xml:space="preserve">$462,467</w:t>
+              <w:t xml:space="preserve">$475,403</w:t>
             </w:r>
           </w:p>
         </w:tc>
@@ -4578,7 +4578,7 @@
         <w:rPr>
           <w:rFonts w:ascii="Calibri" w:cs="Calibri" w:eastAsia="Calibri" w:hAnsi="Calibri"/>
         </w:rPr>
-        <w:t xml:space="preserve">Mid case: five-year net $1,461,774, 16,300 buyers, 1,600 subscribers at the end of Year 5</w:t>
+        <w:t xml:space="preserve">Mid case: five-year net $1,513,333, 16,300 buyers, 1,600 subscribers at the end of Year 5</w:t>
       </w:r>
     </w:p>
     <w:tbl>
@@ -5774,7 +5774,7 @@
                 <w:sz w:val="14"/>
                 <w:szCs w:val="14"/>
               </w:rPr>
-              <w:t xml:space="preserve">($48,731)</w:t>
+              <w:t xml:space="preserve">($45,919)</w:t>
             </w:r>
           </w:p>
         </w:tc>
@@ -5930,7 +5930,7 @@
                 <w:sz w:val="14"/>
                 <w:szCs w:val="14"/>
               </w:rPr>
-              <w:t xml:space="preserve">$184,021</w:t>
+              <w:t xml:space="preserve">$186,834</w:t>
             </w:r>
           </w:p>
         </w:tc>
@@ -5956,7 +5956,7 @@
                 <w:sz w:val="14"/>
                 <w:szCs w:val="14"/>
               </w:rPr>
-              <w:t xml:space="preserve">$248,881</w:t>
+              <w:t xml:space="preserve">$251,693</w:t>
             </w:r>
           </w:p>
         </w:tc>
@@ -6218,7 +6218,7 @@
                 <w:sz w:val="14"/>
                 <w:szCs w:val="14"/>
               </w:rPr>
-              <w:t xml:space="preserve">($75,070)</w:t>
+              <w:t xml:space="preserve">($67,571)</w:t>
             </w:r>
           </w:p>
         </w:tc>
@@ -6374,7 +6374,7 @@
                 <w:sz w:val="14"/>
                 <w:szCs w:val="14"/>
               </w:rPr>
-              <w:t xml:space="preserve">$297,370</w:t>
+              <w:t xml:space="preserve">$304,869</w:t>
             </w:r>
           </w:p>
         </w:tc>
@@ -6400,7 +6400,7 @@
                 <w:sz w:val="14"/>
                 <w:szCs w:val="14"/>
               </w:rPr>
-              <w:t xml:space="preserve">$546,251</w:t>
+              <w:t xml:space="preserve">$556,562</w:t>
             </w:r>
           </w:p>
         </w:tc>
@@ -6662,7 +6662,7 @@
                 <w:sz w:val="14"/>
                 <w:szCs w:val="14"/>
               </w:rPr>
-              <w:t xml:space="preserve">($98,312)</w:t>
+              <w:t xml:space="preserve">($83,313)</w:t>
             </w:r>
           </w:p>
         </w:tc>
@@ -6818,7 +6818,7 @@
                 <w:sz w:val="14"/>
                 <w:szCs w:val="14"/>
               </w:rPr>
-              <w:t xml:space="preserve">$403,078</w:t>
+              <w:t xml:space="preserve">$418,077</w:t>
             </w:r>
           </w:p>
         </w:tc>
@@ -6844,7 +6844,7 @@
                 <w:sz w:val="14"/>
                 <w:szCs w:val="14"/>
               </w:rPr>
-              <w:t xml:space="preserve">$949,329</w:t>
+              <w:t xml:space="preserve">$974,639</w:t>
             </w:r>
           </w:p>
         </w:tc>
@@ -7106,7 +7106,7 @@
                 <w:sz w:val="14"/>
                 <w:szCs w:val="14"/>
               </w:rPr>
-              <w:t xml:space="preserve">($121,405)</w:t>
+              <w:t xml:space="preserve">($95,157)</w:t>
             </w:r>
           </w:p>
         </w:tc>
@@ -7262,7 +7262,7 @@
                 <w:sz w:val="14"/>
                 <w:szCs w:val="14"/>
               </w:rPr>
-              <w:t xml:space="preserve">$512,446</w:t>
+              <w:t xml:space="preserve">$538,694</w:t>
             </w:r>
           </w:p>
         </w:tc>
@@ -7288,7 +7288,7 @@
                 <w:sz w:val="14"/>
                 <w:szCs w:val="14"/>
               </w:rPr>
-              <w:t xml:space="preserve">$1,461,775</w:t>
+              <w:t xml:space="preserve">$1,513,333</w:t>
             </w:r>
           </w:p>
         </w:tc>
@@ -7316,7 +7316,7 @@
         <w:rPr>
           <w:rFonts w:ascii="Calibri" w:cs="Calibri" w:eastAsia="Calibri" w:hAnsi="Calibri"/>
         </w:rPr>
-        <w:t xml:space="preserve">Ceiling case: five-year net $4,889,687, 40,100 buyers, 3,950 subscribers at the end of Year 5</w:t>
+        <w:t xml:space="preserve">Ceiling case: five-year net $5,217,785, 40,100 buyers, 3,950 subscribers at the end of Year 5</w:t>
       </w:r>
     </w:p>
     <w:tbl>
@@ -8512,7 +8512,7 @@
                 <w:sz w:val="14"/>
                 <w:szCs w:val="14"/>
               </w:rPr>
-              <w:t xml:space="preserve">($122,358)</w:t>
+              <w:t xml:space="preserve">($112,983)</w:t>
             </w:r>
           </w:p>
         </w:tc>
@@ -8668,7 +8668,7 @@
                 <w:sz w:val="14"/>
                 <w:szCs w:val="14"/>
               </w:rPr>
-              <w:t xml:space="preserve">$491,097</w:t>
+              <w:t xml:space="preserve">$500,471</w:t>
             </w:r>
           </w:p>
         </w:tc>
@@ -8694,7 +8694,7 @@
                 <w:sz w:val="14"/>
                 <w:szCs w:val="14"/>
               </w:rPr>
-              <w:t xml:space="preserve">$678,919</w:t>
+              <w:t xml:space="preserve">$688,293</w:t>
             </w:r>
           </w:p>
         </w:tc>
@@ -8956,7 +8956,7 @@
                 <w:sz w:val="14"/>
                 <w:szCs w:val="14"/>
               </w:rPr>
-              <w:t xml:space="preserve">($203,020)</w:t>
+              <w:t xml:space="preserve">($165,523)</w:t>
             </w:r>
           </w:p>
         </w:tc>
@@ -9112,7 +9112,7 @@
                 <w:sz w:val="14"/>
                 <w:szCs w:val="14"/>
               </w:rPr>
-              <w:t xml:space="preserve">$864,986</w:t>
+              <w:t xml:space="preserve">$902,483</w:t>
             </w:r>
           </w:p>
         </w:tc>
@@ -9138,7 +9138,7 @@
                 <w:sz w:val="14"/>
                 <w:szCs w:val="14"/>
               </w:rPr>
-              <w:t xml:space="preserve">$1,543,905</w:t>
+              <w:t xml:space="preserve">$1,590,776</w:t>
             </w:r>
           </w:p>
         </w:tc>
@@ -9400,7 +9400,7 @@
                 <w:sz w:val="14"/>
                 <w:szCs w:val="14"/>
               </w:rPr>
-              <w:t xml:space="preserve">($301,576)</w:t>
+              <w:t xml:space="preserve">($207,834)</w:t>
             </w:r>
           </w:p>
         </w:tc>
@@ -9556,7 +9556,7 @@
                 <w:sz w:val="14"/>
                 <w:szCs w:val="14"/>
               </w:rPr>
-              <w:t xml:space="preserve">$1,356,928</w:t>
+              <w:t xml:space="preserve">$1,450,670</w:t>
             </w:r>
           </w:p>
         </w:tc>
@@ -9582,7 +9582,7 @@
                 <w:sz w:val="14"/>
                 <w:szCs w:val="14"/>
               </w:rPr>
-              <w:t xml:space="preserve">$2,900,833</w:t>
+              <w:t xml:space="preserve">$3,041,446</w:t>
             </w:r>
           </w:p>
         </w:tc>
@@ -9844,7 +9844,7 @@
                 <w:sz w:val="14"/>
                 <w:szCs w:val="14"/>
               </w:rPr>
-              <w:t xml:space="preserve">($420,203)</w:t>
+              <w:t xml:space="preserve">($232,718)</w:t>
             </w:r>
           </w:p>
         </w:tc>
@@ -10000,7 +10000,7 @@
                 <w:sz w:val="14"/>
                 <w:szCs w:val="14"/>
               </w:rPr>
-              <w:t xml:space="preserve">$1,988,854</w:t>
+              <w:t xml:space="preserve">$2,176,339</w:t>
             </w:r>
           </w:p>
         </w:tc>
@@ -10026,7 +10026,7 @@
                 <w:sz w:val="14"/>
                 <w:szCs w:val="14"/>
               </w:rPr>
-              <w:t xml:space="preserve">$4,889,687</w:t>
+              <w:t xml:space="preserve">$5,217,785</w:t>
             </w:r>
           </w:p>
         </w:tc>
@@ -10054,7 +10054,7 @@
         <w:rPr>
           <w:rFonts w:ascii="Calibri" w:cs="Calibri" w:eastAsia="Calibri" w:hAnsi="Calibri"/>
         </w:rPr>
-        <w:t xml:space="preserve">National case: five-year net $6,911,806, 42,400 buyers, 6,500 subscribers, 17,500 district seats and 2,500 clinic seats at the end of Year 5</w:t>
+        <w:t xml:space="preserve">National case: five-year net $7,499,198, 42,400 buyers, 6,500 subscribers, 17,500 district seats and 2,500 clinic seats at the end of Year 5</w:t>
       </w:r>
     </w:p>
     <w:p>
@@ -11263,7 +11263,7 @@
                 <w:sz w:val="14"/>
                 <w:szCs w:val="14"/>
               </w:rPr>
-              <w:t xml:space="preserve">($111,386)</w:t>
+              <w:t xml:space="preserve">($99,575)</w:t>
             </w:r>
           </w:p>
         </w:tc>
@@ -11419,7 +11419,7 @@
                 <w:sz w:val="14"/>
                 <w:szCs w:val="14"/>
               </w:rPr>
-              <w:t xml:space="preserve">$471,912</w:t>
+              <w:t xml:space="preserve">$483,724</w:t>
             </w:r>
           </w:p>
         </w:tc>
@@ -11445,7 +11445,7 @@
                 <w:sz w:val="14"/>
                 <w:szCs w:val="14"/>
               </w:rPr>
-              <w:t xml:space="preserve">$620,288</w:t>
+              <w:t xml:space="preserve">$632,099</w:t>
             </w:r>
           </w:p>
         </w:tc>
@@ -11707,7 +11707,7 @@
                 <w:sz w:val="14"/>
                 <w:szCs w:val="14"/>
               </w:rPr>
-              <w:t xml:space="preserve">($213,469)</w:t>
+              <w:t xml:space="preserve">($166,598)</w:t>
             </w:r>
           </w:p>
         </w:tc>
@@ -11863,7 +11863,7 @@
                 <w:sz w:val="14"/>
                 <w:szCs w:val="14"/>
               </w:rPr>
-              <w:t xml:space="preserve">$956,482</w:t>
+              <w:t xml:space="preserve">$1,003,354</w:t>
             </w:r>
           </w:p>
         </w:tc>
@@ -11889,7 +11889,7 @@
                 <w:sz w:val="14"/>
                 <w:szCs w:val="14"/>
               </w:rPr>
-              <w:t xml:space="preserve">$1,576,770</w:t>
+              <w:t xml:space="preserve">$1,635,453</w:t>
             </w:r>
           </w:p>
         </w:tc>
@@ -12151,7 +12151,7 @@
                 <w:sz w:val="14"/>
                 <w:szCs w:val="14"/>
               </w:rPr>
-              <w:t xml:space="preserve">($393,653)</w:t>
+              <w:t xml:space="preserve">($239,915)</w:t>
             </w:r>
           </w:p>
         </w:tc>
@@ -12307,7 +12307,7 @@
                 <w:sz w:val="14"/>
                 <w:szCs w:val="14"/>
               </w:rPr>
-              <w:t xml:space="preserve">$1,874,409</w:t>
+              <w:t xml:space="preserve">$2,028,147</w:t>
             </w:r>
           </w:p>
         </w:tc>
@@ -12333,7 +12333,7 @@
                 <w:sz w:val="14"/>
                 <w:szCs w:val="14"/>
               </w:rPr>
-              <w:t xml:space="preserve">$3,451,179</w:t>
+              <w:t xml:space="preserve">$3,663,600</w:t>
             </w:r>
           </w:p>
         </w:tc>
@@ -12595,7 +12595,7 @@
                 <w:sz w:val="14"/>
                 <w:szCs w:val="14"/>
               </w:rPr>
-              <w:t xml:space="preserve">($692,248)</w:t>
+              <w:t xml:space="preserve">($317,278)</w:t>
             </w:r>
           </w:p>
         </w:tc>
@@ -12751,7 +12751,7 @@
                 <w:sz w:val="14"/>
                 <w:szCs w:val="14"/>
               </w:rPr>
-              <w:t xml:space="preserve">$3,460,628</w:t>
+              <w:t xml:space="preserve">$3,835,598</w:t>
             </w:r>
           </w:p>
         </w:tc>
@@ -12777,7 +12777,7 @@
                 <w:sz w:val="14"/>
                 <w:szCs w:val="14"/>
               </w:rPr>
-              <w:t xml:space="preserve">$6,911,808</w:t>
+              <w:t xml:space="preserve">$7,499,198</w:t>
             </w:r>
           </w:p>
         </w:tc>
@@ -12841,7 +12841,7 @@
           <w:sz w:val="22"/>
           <w:szCs w:val="22"/>
         </w:rPr>
-        <w:t xml:space="preserve">The document’s five-year nets were $674,380, $2,098,800 and $6,081,210. These are $462,467, $1,461,774 and $4,889,687.</w:t>
+        <w:t xml:space="preserve">The document’s five-year nets were $674,380, $2,098,800 and $6,081,210. These are $475,403, $1,513,333 and $5,217,785.</w:t>
       </w:r>
     </w:p>
     <w:p>

</xml_diff>

<commit_message>
Direct selling cost for Pro seats (10% placeholder, Frank's to set) on Frank's go; documents regenerated; his direction for the direct sales design recorded
Co-Authored-By: Claude Fable 5.1 <noreply@anthropic.com>
Claude-Session: https://claude.ai/code/session_01FdLL4Wp3bi12KNX6zHRo7N
</commit_message>
<xml_diff>
--- a/EZvoxa Business Plan and Projections.docx
+++ b/EZvoxa Business Plan and Projections.docx
@@ -1840,7 +1840,7 @@
         <w:rPr>
           <w:rFonts w:ascii="Calibri" w:cs="Calibri" w:eastAsia="Calibri" w:hAnsi="Calibri"/>
         </w:rPr>
-        <w:t xml:space="preserve">Floor case: five-year net $475,403, 6,350 buyers, 620 subscribers at the end of Year 5</w:t>
+        <w:t xml:space="preserve">Floor case: five-year net $466,779, 6,350 buyers, 620 subscribers at the end of Year 5</w:t>
       </w:r>
     </w:p>
     <w:tbl>
@@ -3192,7 +3192,7 @@
                 <w:sz w:val="14"/>
                 <w:szCs w:val="14"/>
               </w:rPr>
-              <w:t xml:space="preserve">$61,666</w:t>
+              <w:t xml:space="preserve">$60,916</w:t>
             </w:r>
           </w:p>
         </w:tc>
@@ -3218,7 +3218,7 @@
                 <w:sz w:val="14"/>
                 <w:szCs w:val="14"/>
               </w:rPr>
-              <w:t xml:space="preserve">$74,033</w:t>
+              <w:t xml:space="preserve">$73,283</w:t>
             </w:r>
           </w:p>
         </w:tc>
@@ -3636,7 +3636,7 @@
                 <w:sz w:val="14"/>
                 <w:szCs w:val="14"/>
               </w:rPr>
-              <w:t xml:space="preserve">$101,251</w:t>
+              <w:t xml:space="preserve">$99,751</w:t>
             </w:r>
           </w:p>
         </w:tc>
@@ -3662,7 +3662,7 @@
                 <w:sz w:val="14"/>
                 <w:szCs w:val="14"/>
               </w:rPr>
-              <w:t xml:space="preserve">$175,284</w:t>
+              <w:t xml:space="preserve">$173,034</w:t>
             </w:r>
           </w:p>
         </w:tc>
@@ -4080,7 +4080,7 @@
                 <w:sz w:val="14"/>
                 <w:szCs w:val="14"/>
               </w:rPr>
-              <w:t xml:space="preserve">$135,435</w:t>
+              <w:t xml:space="preserve">$132,810</w:t>
             </w:r>
           </w:p>
         </w:tc>
@@ -4106,7 +4106,7 @@
                 <w:sz w:val="14"/>
                 <w:szCs w:val="14"/>
               </w:rPr>
-              <w:t xml:space="preserve">$310,719</w:t>
+              <w:t xml:space="preserve">$305,844</w:t>
             </w:r>
           </w:p>
         </w:tc>
@@ -4524,7 +4524,7 @@
                 <w:sz w:val="14"/>
                 <w:szCs w:val="14"/>
               </w:rPr>
-              <w:t xml:space="preserve">$164,684</w:t>
+              <w:t xml:space="preserve">$160,935</w:t>
             </w:r>
           </w:p>
         </w:tc>
@@ -4550,7 +4550,7 @@
                 <w:sz w:val="14"/>
                 <w:szCs w:val="14"/>
               </w:rPr>
-              <w:t xml:space="preserve">$475,403</w:t>
+              <w:t xml:space="preserve">$466,779</w:t>
             </w:r>
           </w:p>
         </w:tc>
@@ -4578,7 +4578,7 @@
         <w:rPr>
           <w:rFonts w:ascii="Calibri" w:cs="Calibri" w:eastAsia="Calibri" w:hAnsi="Calibri"/>
         </w:rPr>
-        <w:t xml:space="preserve">Mid case: five-year net $1,513,333, 16,300 buyers, 1,600 subscribers at the end of Year 5</w:t>
+        <w:t xml:space="preserve">Mid case: five-year net $1,478,961, 16,300 buyers, 1,600 subscribers at the end of Year 5</w:t>
       </w:r>
     </w:p>
     <w:tbl>
@@ -5930,7 +5930,7 @@
                 <w:sz w:val="14"/>
                 <w:szCs w:val="14"/>
               </w:rPr>
-              <w:t xml:space="preserve">$186,834</w:t>
+              <w:t xml:space="preserve">$184,959</w:t>
             </w:r>
           </w:p>
         </w:tc>
@@ -5956,7 +5956,7 @@
                 <w:sz w:val="14"/>
                 <w:szCs w:val="14"/>
               </w:rPr>
-              <w:t xml:space="preserve">$251,693</w:t>
+              <w:t xml:space="preserve">$249,818</w:t>
             </w:r>
           </w:p>
         </w:tc>
@@ -6374,7 +6374,7 @@
                 <w:sz w:val="14"/>
                 <w:szCs w:val="14"/>
               </w:rPr>
-              <w:t xml:space="preserve">$304,869</w:t>
+              <w:t xml:space="preserve">$299,870</w:t>
             </w:r>
           </w:p>
         </w:tc>
@@ -6400,7 +6400,7 @@
                 <w:sz w:val="14"/>
                 <w:szCs w:val="14"/>
               </w:rPr>
-              <w:t xml:space="preserve">$556,562</w:t>
+              <w:t xml:space="preserve">$549,688</w:t>
             </w:r>
           </w:p>
         </w:tc>
@@ -6818,7 +6818,7 @@
                 <w:sz w:val="14"/>
                 <w:szCs w:val="14"/>
               </w:rPr>
-              <w:t xml:space="preserve">$418,077</w:t>
+              <w:t xml:space="preserve">$408,078</w:t>
             </w:r>
           </w:p>
         </w:tc>
@@ -6844,7 +6844,7 @@
                 <w:sz w:val="14"/>
                 <w:szCs w:val="14"/>
               </w:rPr>
-              <w:t xml:space="preserve">$974,639</w:t>
+              <w:t xml:space="preserve">$957,766</w:t>
             </w:r>
           </w:p>
         </w:tc>
@@ -7262,7 +7262,7 @@
                 <w:sz w:val="14"/>
                 <w:szCs w:val="14"/>
               </w:rPr>
-              <w:t xml:space="preserve">$538,694</w:t>
+              <w:t xml:space="preserve">$521,195</w:t>
             </w:r>
           </w:p>
         </w:tc>
@@ -7288,7 +7288,7 @@
                 <w:sz w:val="14"/>
                 <w:szCs w:val="14"/>
               </w:rPr>
-              <w:t xml:space="preserve">$1,513,333</w:t>
+              <w:t xml:space="preserve">$1,478,961</w:t>
             </w:r>
           </w:p>
         </w:tc>
@@ -7316,7 +7316,7 @@
         <w:rPr>
           <w:rFonts w:ascii="Calibri" w:cs="Calibri" w:eastAsia="Calibri" w:hAnsi="Calibri"/>
         </w:rPr>
-        <w:t xml:space="preserve">Ceiling case: five-year net $5,217,785, 40,100 buyers, 3,950 subscribers at the end of Year 5</w:t>
+        <w:t xml:space="preserve">Ceiling case: five-year net $4,999,052, 40,100 buyers, 3,950 subscribers at the end of Year 5</w:t>
       </w:r>
     </w:p>
     <w:tbl>
@@ -8668,7 +8668,7 @@
                 <w:sz w:val="14"/>
                 <w:szCs w:val="14"/>
               </w:rPr>
-              <w:t xml:space="preserve">$500,471</w:t>
+              <w:t xml:space="preserve">$494,221</w:t>
             </w:r>
           </w:p>
         </w:tc>
@@ -8694,7 +8694,7 @@
                 <w:sz w:val="14"/>
                 <w:szCs w:val="14"/>
               </w:rPr>
-              <w:t xml:space="preserve">$688,293</w:t>
+              <w:t xml:space="preserve">$682,044</w:t>
             </w:r>
           </w:p>
         </w:tc>
@@ -9112,7 +9112,7 @@
                 <w:sz w:val="14"/>
                 <w:szCs w:val="14"/>
               </w:rPr>
-              <w:t xml:space="preserve">$902,483</w:t>
+              <w:t xml:space="preserve">$877,485</w:t>
             </w:r>
           </w:p>
         </w:tc>
@@ -9138,7 +9138,7 @@
                 <w:sz w:val="14"/>
                 <w:szCs w:val="14"/>
               </w:rPr>
-              <w:t xml:space="preserve">$1,590,776</w:t>
+              <w:t xml:space="preserve">$1,559,529</w:t>
             </w:r>
           </w:p>
         </w:tc>
@@ -9556,7 +9556,7 @@
                 <w:sz w:val="14"/>
                 <w:szCs w:val="14"/>
               </w:rPr>
-              <w:t xml:space="preserve">$1,450,670</w:t>
+              <w:t xml:space="preserve">$1,388,175</w:t>
             </w:r>
           </w:p>
         </w:tc>
@@ -9582,7 +9582,7 @@
                 <w:sz w:val="14"/>
                 <w:szCs w:val="14"/>
               </w:rPr>
-              <w:t xml:space="preserve">$3,041,446</w:t>
+              <w:t xml:space="preserve">$2,947,704</w:t>
             </w:r>
           </w:p>
         </w:tc>
@@ -10000,7 +10000,7 @@
                 <w:sz w:val="14"/>
                 <w:szCs w:val="14"/>
               </w:rPr>
-              <w:t xml:space="preserve">$2,176,339</w:t>
+              <w:t xml:space="preserve">$2,051,349</w:t>
             </w:r>
           </w:p>
         </w:tc>
@@ -10026,7 +10026,7 @@
                 <w:sz w:val="14"/>
                 <w:szCs w:val="14"/>
               </w:rPr>
-              <w:t xml:space="preserve">$5,217,785</w:t>
+              <w:t xml:space="preserve">$4,999,053</w:t>
             </w:r>
           </w:p>
         </w:tc>
@@ -10054,7 +10054,7 @@
         <w:rPr>
           <w:rFonts w:ascii="Calibri" w:cs="Calibri" w:eastAsia="Calibri" w:hAnsi="Calibri"/>
         </w:rPr>
-        <w:t xml:space="preserve">National case: five-year net $7,499,198, 42,400 buyers, 6,500 subscribers, 17,500 district seats and 2,500 clinic seats at the end of Year 5</w:t>
+        <w:t xml:space="preserve">National case: five-year net $7,107,604, 42,400 buyers, 6,500 subscribers, 17,500 district seats and 2,500 clinic seats at the end of Year 5</w:t>
       </w:r>
     </w:p>
     <w:p>
@@ -11419,7 +11419,7 @@
                 <w:sz w:val="14"/>
                 <w:szCs w:val="14"/>
               </w:rPr>
-              <w:t xml:space="preserve">$483,724</w:t>
+              <w:t xml:space="preserve">$475,850</w:t>
             </w:r>
           </w:p>
         </w:tc>
@@ -11445,7 +11445,7 @@
                 <w:sz w:val="14"/>
                 <w:szCs w:val="14"/>
               </w:rPr>
-              <w:t xml:space="preserve">$632,099</w:t>
+              <w:t xml:space="preserve">$624,225</w:t>
             </w:r>
           </w:p>
         </w:tc>
@@ -11863,7 +11863,7 @@
                 <w:sz w:val="14"/>
                 <w:szCs w:val="14"/>
               </w:rPr>
-              <w:t xml:space="preserve">$1,003,354</w:t>
+              <w:t xml:space="preserve">$972,106</w:t>
             </w:r>
           </w:p>
         </w:tc>
@@ -11889,7 +11889,7 @@
                 <w:sz w:val="14"/>
                 <w:szCs w:val="14"/>
               </w:rPr>
-              <w:t xml:space="preserve">$1,635,453</w:t>
+              <w:t xml:space="preserve">$1,596,331</w:t>
             </w:r>
           </w:p>
         </w:tc>
@@ -12307,7 +12307,7 @@
                 <w:sz w:val="14"/>
                 <w:szCs w:val="14"/>
               </w:rPr>
-              <w:t xml:space="preserve">$2,028,147</w:t>
+              <w:t xml:space="preserve">$1,925,655</w:t>
             </w:r>
           </w:p>
         </w:tc>
@@ -12333,7 +12333,7 @@
                 <w:sz w:val="14"/>
                 <w:szCs w:val="14"/>
               </w:rPr>
-              <w:t xml:space="preserve">$3,663,600</w:t>
+              <w:t xml:space="preserve">$3,521,986</w:t>
             </w:r>
           </w:p>
         </w:tc>
@@ -12751,7 +12751,7 @@
                 <w:sz w:val="14"/>
                 <w:szCs w:val="14"/>
               </w:rPr>
-              <w:t xml:space="preserve">$3,835,598</w:t>
+              <w:t xml:space="preserve">$3,585,618</w:t>
             </w:r>
           </w:p>
         </w:tc>
@@ -12777,7 +12777,7 @@
                 <w:sz w:val="14"/>
                 <w:szCs w:val="14"/>
               </w:rPr>
-              <w:t xml:space="preserve">$7,499,198</w:t>
+              <w:t xml:space="preserve">$7,107,605</w:t>
             </w:r>
           </w:p>
         </w:tc>
@@ -12841,7 +12841,7 @@
           <w:sz w:val="22"/>
           <w:szCs w:val="22"/>
         </w:rPr>
-        <w:t xml:space="preserve">The document’s five-year nets were $674,380, $2,098,800 and $6,081,210. These are $475,403, $1,513,333 and $5,217,785.</w:t>
+        <w:t xml:space="preserve">The document’s five-year nets were $674,380, $2,098,800 and $6,081,210. These are $466,779, $1,478,961 and $4,999,052.</w:t>
       </w:r>
     </w:p>
     <w:p>

</xml_diff>

<commit_message>
Sales staff built into the model on Frank's instruction: added when a year's new districts outgrow the sellers on hand; both inputs on the finance widget as placeholders
Co-Authored-By: Claude Fable 5.1 <noreply@anthropic.com>
Claude-Session: https://claude.ai/code/session_01FdLL4Wp3bi12KNX6zHRo7N
</commit_message>
<xml_diff>
--- a/EZvoxa Business Plan and Projections.docx
+++ b/EZvoxa Business Plan and Projections.docx
@@ -7316,7 +7316,7 @@
         <w:rPr>
           <w:rFonts w:ascii="Calibri" w:cs="Calibri" w:eastAsia="Calibri" w:hAnsi="Calibri"/>
         </w:rPr>
-        <w:t xml:space="preserve">Ceiling case: five-year net $4,999,052, 40,100 buyers, 3,950 subscribers at the end of Year 5</w:t>
+        <w:t xml:space="preserve">Ceiling case: five-year net $4,149,052, 40,100 buyers, 3,950 subscribers at the end of Year 5</w:t>
       </w:r>
     </w:p>
     <w:tbl>
@@ -9112,7 +9112,7 @@
                 <w:sz w:val="14"/>
                 <w:szCs w:val="14"/>
               </w:rPr>
-              <w:t xml:space="preserve">$877,485</w:t>
+              <w:t xml:space="preserve">$792,485</w:t>
             </w:r>
           </w:p>
         </w:tc>
@@ -9138,7 +9138,7 @@
                 <w:sz w:val="14"/>
                 <w:szCs w:val="14"/>
               </w:rPr>
-              <w:t xml:space="preserve">$1,559,529</w:t>
+              <w:t xml:space="preserve">$1,474,529</w:t>
             </w:r>
           </w:p>
         </w:tc>
@@ -9556,7 +9556,7 @@
                 <w:sz w:val="14"/>
                 <w:szCs w:val="14"/>
               </w:rPr>
-              <w:t xml:space="preserve">$1,388,175</w:t>
+              <w:t xml:space="preserve">$1,133,175</w:t>
             </w:r>
           </w:p>
         </w:tc>
@@ -9582,7 +9582,7 @@
                 <w:sz w:val="14"/>
                 <w:szCs w:val="14"/>
               </w:rPr>
-              <w:t xml:space="preserve">$2,947,704</w:t>
+              <w:t xml:space="preserve">$2,607,704</w:t>
             </w:r>
           </w:p>
         </w:tc>
@@ -10000,7 +10000,7 @@
                 <w:sz w:val="14"/>
                 <w:szCs w:val="14"/>
               </w:rPr>
-              <w:t xml:space="preserve">$2,051,349</w:t>
+              <w:t xml:space="preserve">$1,541,349</w:t>
             </w:r>
           </w:p>
         </w:tc>
@@ -10026,7 +10026,7 @@
                 <w:sz w:val="14"/>
                 <w:szCs w:val="14"/>
               </w:rPr>
-              <w:t xml:space="preserve">$4,999,053</w:t>
+              <w:t xml:space="preserve">$4,149,053</w:t>
             </w:r>
           </w:p>
         </w:tc>
@@ -10054,7 +10054,7 @@
         <w:rPr>
           <w:rFonts w:ascii="Calibri" w:cs="Calibri" w:eastAsia="Calibri" w:hAnsi="Calibri"/>
         </w:rPr>
-        <w:t xml:space="preserve">National case: five-year net $7,107,604, 42,400 buyers, 6,500 subscribers, 17,500 district seats and 2,500 clinic seats at the end of Year 5</w:t>
+        <w:t xml:space="preserve">National case: five-year net $5,832,604, 42,400 buyers, 6,500 subscribers, 17,500 district seats and 2,500 clinic seats at the end of Year 5</w:t>
       </w:r>
     </w:p>
     <w:p>
@@ -11863,7 +11863,7 @@
                 <w:sz w:val="14"/>
                 <w:szCs w:val="14"/>
               </w:rPr>
-              <w:t xml:space="preserve">$972,106</w:t>
+              <w:t xml:space="preserve">$887,106</w:t>
             </w:r>
           </w:p>
         </w:tc>
@@ -11889,7 +11889,7 @@
                 <w:sz w:val="14"/>
                 <w:szCs w:val="14"/>
               </w:rPr>
-              <w:t xml:space="preserve">$1,596,331</w:t>
+              <w:t xml:space="preserve">$1,511,331</w:t>
             </w:r>
           </w:p>
         </w:tc>
@@ -12307,7 +12307,7 @@
                 <w:sz w:val="14"/>
                 <w:szCs w:val="14"/>
               </w:rPr>
-              <w:t xml:space="preserve">$1,925,655</w:t>
+              <w:t xml:space="preserve">$1,585,655</w:t>
             </w:r>
           </w:p>
         </w:tc>
@@ -12333,7 +12333,7 @@
                 <w:sz w:val="14"/>
                 <w:szCs w:val="14"/>
               </w:rPr>
-              <w:t xml:space="preserve">$3,521,986</w:t>
+              <w:t xml:space="preserve">$3,096,986</w:t>
             </w:r>
           </w:p>
         </w:tc>
@@ -12751,7 +12751,7 @@
                 <w:sz w:val="14"/>
                 <w:szCs w:val="14"/>
               </w:rPr>
-              <w:t xml:space="preserve">$3,585,618</w:t>
+              <w:t xml:space="preserve">$2,735,618</w:t>
             </w:r>
           </w:p>
         </w:tc>
@@ -12777,7 +12777,7 @@
                 <w:sz w:val="14"/>
                 <w:szCs w:val="14"/>
               </w:rPr>
-              <w:t xml:space="preserve">$7,107,605</w:t>
+              <w:t xml:space="preserve">$5,832,605</w:t>
             </w:r>
           </w:p>
         </w:tc>
@@ -12841,7 +12841,7 @@
           <w:sz w:val="22"/>
           <w:szCs w:val="22"/>
         </w:rPr>
-        <w:t xml:space="preserve">The document’s five-year nets were $674,380, $2,098,800 and $6,081,210. These are $466,779, $1,478,961 and $4,999,052.</w:t>
+        <w:t xml:space="preserve">The document’s five-year nets were $674,380, $2,098,800 and $6,081,210. These are $466,779, $1,478,961 and $4,149,052.</w:t>
       </w:r>
     </w:p>
     <w:p>

</xml_diff>